<commit_message>
docs: agregar evidencias de la fase 2 y material de documentos
Incluye las carpetas nuevas del proyecto y las autoevaluaciones de la fase 1 actualizadas.

Co-authored-by: Cursor <cursoragent@cursor.com>
</commit_message>
<xml_diff>
--- a/Fase 1/Evidencias Individuales/Tania_Herrera_1.3_APT122_AutoevaluacionFase1.docx
+++ b/Fase 1/Evidencias Individuales/Tania_Herrera_1.3_APT122_AutoevaluacionFase1.docx
@@ -1,6 +1,6 @@
 
 <file path=word/document.xml><?xml version="1.0" encoding="utf-8"?>
-<w:document xmlns:wpc="http://schemas.microsoft.com/office/word/2010/wordprocessingCanvas" xmlns:cx="http://schemas.microsoft.com/office/drawing/2014/chartex" xmlns:cx1="http://schemas.microsoft.com/office/drawing/2015/9/8/chartex" xmlns:cx2="http://schemas.microsoft.com/office/drawing/2015/10/21/chartex" xmlns:cx3="http://schemas.microsoft.com/office/drawing/2016/5/9/chartex" xmlns:cx4="http://schemas.microsoft.com/office/drawing/2016/5/10/chartex" xmlns:cx5="http://schemas.microsoft.com/office/drawing/2016/5/11/chartex" xmlns:cx6="http://schemas.microsoft.com/office/drawing/2016/5/12/chartex" xmlns:cx7="http://schemas.microsoft.com/office/drawing/2016/5/13/chartex" xmlns:cx8="http://schemas.microsoft.com/office/drawing/2016/5/14/chartex" xmlns:mc="http://schemas.openxmlformats.org/markup-compatibility/2006" xmlns:aink="http://schemas.microsoft.com/office/drawing/2016/ink" xmlns:am3d="http://schemas.microsoft.com/office/drawing/2017/model3d" xmlns:o="urn:schemas-microsoft-com:office:office" xmlns:oel="http://schemas.microsoft.com/office/2019/extlst" xmlns:r="http://schemas.openxmlformats.org/officeDocument/2006/relationships" xmlns:m="http://schemas.openxmlformats.org/officeDocument/2006/math" xmlns:v="urn:schemas-microsoft-com:vml" xmlns:wp14="http://schemas.microsoft.com/office/word/2010/wordprocessingDrawing" xmlns:wp="http://schemas.openxmlformats.org/drawingml/2006/wordprocessingDrawing" xmlns:w10="urn:schemas-microsoft-com:office:word" xmlns:w="http://schemas.openxmlformats.org/wordprocessingml/2006/main" xmlns:w14="http://schemas.microsoft.com/office/word/2010/wordml" xmlns:w15="http://schemas.microsoft.com/office/word/2012/wordml" xmlns:w16cex="http://schemas.microsoft.com/office/word/2018/wordml/cex" xmlns:w16cid="http://schemas.microsoft.com/office/word/2016/wordml/cid" xmlns:w16="http://schemas.microsoft.com/office/word/2018/wordml" xmlns:w16sdtdh="http://schemas.microsoft.com/office/word/2020/wordml/sdtdatahash" xmlns:w16se="http://schemas.microsoft.com/office/word/2015/wordml/symex" xmlns:wpg="http://schemas.microsoft.com/office/word/2010/wordprocessingGroup" xmlns:wpi="http://schemas.microsoft.com/office/word/2010/wordprocessingInk" xmlns:wne="http://schemas.microsoft.com/office/word/2006/wordml" xmlns:wps="http://schemas.microsoft.com/office/word/2010/wordprocessingShape" mc:Ignorable="w14 w15 w16se w16cid w16 w16cex w16sdtdh wp14">
+<w:document xmlns:wpc="http://schemas.microsoft.com/office/word/2010/wordprocessingCanvas" xmlns:cx="http://schemas.microsoft.com/office/drawing/2014/chartex" xmlns:cx1="http://schemas.microsoft.com/office/drawing/2015/9/8/chartex" xmlns:cx2="http://schemas.microsoft.com/office/drawing/2015/10/21/chartex" xmlns:cx3="http://schemas.microsoft.com/office/drawing/2016/5/9/chartex" xmlns:cx4="http://schemas.microsoft.com/office/drawing/2016/5/10/chartex" xmlns:cx5="http://schemas.microsoft.com/office/drawing/2016/5/11/chartex" xmlns:cx6="http://schemas.microsoft.com/office/drawing/2016/5/12/chartex" xmlns:cx7="http://schemas.microsoft.com/office/drawing/2016/5/13/chartex" xmlns:cx8="http://schemas.microsoft.com/office/drawing/2016/5/14/chartex" xmlns:mc="http://schemas.openxmlformats.org/markup-compatibility/2006" xmlns:aink="http://schemas.microsoft.com/office/drawing/2016/ink" xmlns:am3d="http://schemas.microsoft.com/office/drawing/2017/model3d" xmlns:o="urn:schemas-microsoft-com:office:office" xmlns:oel="http://schemas.microsoft.com/office/2019/extlst" xmlns:r="http://schemas.openxmlformats.org/officeDocument/2006/relationships" xmlns:m="http://schemas.openxmlformats.org/officeDocument/2006/math" xmlns:v="urn:schemas-microsoft-com:vml" xmlns:wp14="http://schemas.microsoft.com/office/word/2010/wordprocessingDrawing" xmlns:wp="http://schemas.openxmlformats.org/drawingml/2006/wordprocessingDrawing" xmlns:w10="urn:schemas-microsoft-com:office:word" xmlns:w="http://schemas.openxmlformats.org/wordprocessingml/2006/main" xmlns:w14="http://schemas.microsoft.com/office/word/2010/wordml" xmlns:w15="http://schemas.microsoft.com/office/word/2012/wordml" xmlns:w16cex="http://schemas.microsoft.com/office/word/2018/wordml/cex" xmlns:w16cid="http://schemas.microsoft.com/office/word/2016/wordml/cid" xmlns:w16="http://schemas.microsoft.com/office/word/2018/wordml" xmlns:w16du="http://schemas.microsoft.com/office/word/2023/wordml/word16du" xmlns:w16sdtdh="http://schemas.microsoft.com/office/word/2020/wordml/sdtdatahash" xmlns:w16sdtfl="http://schemas.microsoft.com/office/word/2024/wordml/sdtformatlock" xmlns:w16se="http://schemas.microsoft.com/office/word/2015/wordml/symex" xmlns:wpg="http://schemas.microsoft.com/office/word/2010/wordprocessingGroup" xmlns:wpi="http://schemas.microsoft.com/office/word/2010/wordprocessingInk" xmlns:wne="http://schemas.microsoft.com/office/word/2006/wordml" xmlns:wps="http://schemas.microsoft.com/office/word/2010/wordprocessingShape" mc:Ignorable="w14 w15 w16se w16cid w16 w16cex w16sdtdh w16sdtfl w16du wp14">
   <w:body>
     <w:p>
       <w:pPr>
@@ -294,7 +294,6 @@
         <w:tc>
           <w:tcPr>
             <w:tcW w:w="706" w:type="pct"/>
-            <w:shd w:val="clear" w:color="auto" w:fill="auto"/>
             <w:vAlign w:val="center"/>
           </w:tcPr>
           <w:p>
@@ -327,7 +326,6 @@
         <w:tc>
           <w:tcPr>
             <w:tcW w:w="2401" w:type="pct"/>
-            <w:shd w:val="clear" w:color="auto" w:fill="auto"/>
             <w:vAlign w:val="center"/>
           </w:tcPr>
           <w:p>
@@ -336,7 +334,6 @@
               <w:spacing w:before="120" w:after="120"/>
               <w:jc w:val="center"/>
             </w:pPr>
-            <w:proofErr w:type="spellStart"/>
             <w:r>
               <w:rPr>
                 <w:rFonts w:asciiTheme="minorHAnsi" w:eastAsiaTheme="minorEastAsia" w:hAnsiTheme="minorHAnsi" w:cstheme="minorBidi"/>
@@ -349,7 +346,6 @@
               </w:rPr>
               <w:t>Capstone</w:t>
             </w:r>
-            <w:proofErr w:type="spellEnd"/>
           </w:p>
         </w:tc>
         <w:tc>
@@ -1894,32 +1890,14 @@
                 <w:bCs/>
                 <w:color w:val="3B3838" w:themeColor="background2" w:themeShade="40"/>
               </w:rPr>
-              <w:t xml:space="preserve">IL </w:t>
-            </w:r>
-            <w:proofErr w:type="gramStart"/>
-            <w:r>
-              <w:rPr>
-                <w:rFonts w:asciiTheme="minorHAnsi" w:eastAsiaTheme="minorEastAsia" w:hAnsiTheme="minorHAnsi" w:cstheme="minorBidi"/>
-                <w:b/>
-                <w:bCs/>
+              <w:t xml:space="preserve">IL 1.3  </w:t>
+            </w:r>
+            <w:r>
+              <w:rPr>
+                <w:rFonts w:asciiTheme="minorHAnsi" w:eastAsiaTheme="minorEastAsia" w:hAnsiTheme="minorHAnsi" w:cstheme="minorBidi"/>
                 <w:color w:val="3B3838" w:themeColor="background2" w:themeShade="40"/>
               </w:rPr>
-              <w:t xml:space="preserve">1.3  </w:t>
-            </w:r>
-            <w:r>
-              <w:rPr>
-                <w:rFonts w:asciiTheme="minorHAnsi" w:eastAsiaTheme="minorEastAsia" w:hAnsiTheme="minorHAnsi" w:cstheme="minorBidi"/>
-                <w:color w:val="3B3838" w:themeColor="background2" w:themeShade="40"/>
-              </w:rPr>
-              <w:t>Establece</w:t>
-            </w:r>
-            <w:proofErr w:type="gramEnd"/>
-            <w:r>
-              <w:rPr>
-                <w:rFonts w:asciiTheme="minorHAnsi" w:eastAsiaTheme="minorEastAsia" w:hAnsiTheme="minorHAnsi" w:cstheme="minorBidi"/>
-                <w:color w:val="3B3838" w:themeColor="background2" w:themeShade="40"/>
-              </w:rPr>
-              <w:t xml:space="preserve"> un plan de trabajo para su Proyecto APT y evidencias que permiten cumplir los objetivos propuestos, considerando recursos y tiempos pertinentes para el desarrollo de las actividades en el periodo académico establecido.</w:t>
+              <w:t>Establece un plan de trabajo para su Proyecto APT y evidencias que permiten cumplir los objetivos propuestos, considerando recursos y tiempos pertinentes para el desarrollo de las actividades en el periodo académico establecido.</w:t>
             </w:r>
           </w:p>
         </w:tc>
@@ -2485,23 +2463,7 @@
                 <w:rFonts w:asciiTheme="minorHAnsi" w:eastAsiaTheme="minorEastAsia" w:hAnsiTheme="minorHAnsi" w:cstheme="minorBidi"/>
                 <w:color w:val="3B3838" w:themeColor="background2" w:themeShade="40"/>
               </w:rPr>
-              <w:t xml:space="preserve">el diseño del Proyecto APT </w:t>
-            </w:r>
-            <w:proofErr w:type="gramStart"/>
-            <w:r>
-              <w:rPr>
-                <w:rFonts w:asciiTheme="minorHAnsi" w:eastAsiaTheme="minorEastAsia" w:hAnsiTheme="minorHAnsi" w:cstheme="minorBidi"/>
-                <w:color w:val="3B3838" w:themeColor="background2" w:themeShade="40"/>
-              </w:rPr>
-              <w:t>de acuerdo a</w:t>
-            </w:r>
-            <w:proofErr w:type="gramEnd"/>
-            <w:r>
-              <w:rPr>
-                <w:rFonts w:asciiTheme="minorHAnsi" w:eastAsiaTheme="minorEastAsia" w:hAnsiTheme="minorHAnsi" w:cstheme="minorBidi"/>
-                <w:color w:val="3B3838" w:themeColor="background2" w:themeShade="40"/>
-              </w:rPr>
-              <w:t xml:space="preserve"> estándares definidos por la disciplina.</w:t>
+              <w:t>el diseño del Proyecto APT de acuerdo a estándares definidos por la disciplina.</w:t>
             </w:r>
           </w:p>
         </w:tc>
@@ -2525,25 +2487,7 @@
                 <w:color w:val="000000" w:themeColor="text1"/>
                 <w:lang w:eastAsia="es-CL"/>
               </w:rPr>
-              <w:t xml:space="preserve">11. Cumple con los indicadores de calidad requeridos en la presentación del diseño del Proyecto APT </w:t>
-            </w:r>
-            <w:proofErr w:type="gramStart"/>
-            <w:r>
-              <w:rPr>
-                <w:rFonts w:asciiTheme="minorHAnsi" w:eastAsiaTheme="minorEastAsia" w:hAnsiTheme="minorHAnsi" w:cstheme="minorBidi"/>
-                <w:color w:val="000000" w:themeColor="text1"/>
-                <w:lang w:eastAsia="es-CL"/>
-              </w:rPr>
-              <w:t>de acuerdo a</w:t>
-            </w:r>
-            <w:proofErr w:type="gramEnd"/>
-            <w:r>
-              <w:rPr>
-                <w:rFonts w:asciiTheme="minorHAnsi" w:eastAsiaTheme="minorEastAsia" w:hAnsiTheme="minorHAnsi" w:cstheme="minorBidi"/>
-                <w:color w:val="000000" w:themeColor="text1"/>
-                <w:lang w:eastAsia="es-CL"/>
-              </w:rPr>
-              <w:t xml:space="preserve"> estándares definidos por la disciplina.</w:t>
+              <w:t>11. Cumple con los indicadores de calidad requeridos en la presentación del diseño del Proyecto APT de acuerdo a estándares definidos por la disciplina.</w:t>
             </w:r>
           </w:p>
         </w:tc>
@@ -2651,27 +2595,7 @@
                 <w:color w:val="000000" w:themeColor="text1"/>
                 <w:lang w:eastAsia="es-CL"/>
               </w:rPr>
-              <w:t xml:space="preserve">Redacta el </w:t>
-            </w:r>
-            <w:proofErr w:type="spellStart"/>
-            <w:proofErr w:type="gramStart"/>
-            <w:r>
-              <w:rPr>
-                <w:rFonts w:asciiTheme="minorHAnsi" w:eastAsiaTheme="minorEastAsia" w:hAnsiTheme="minorHAnsi" w:cstheme="minorBidi"/>
-                <w:color w:val="000000" w:themeColor="text1"/>
-                <w:lang w:eastAsia="es-CL"/>
-              </w:rPr>
-              <w:t>abstract</w:t>
-            </w:r>
-            <w:proofErr w:type="spellEnd"/>
-            <w:proofErr w:type="gramEnd"/>
-            <w:r>
-              <w:rPr>
-                <w:rFonts w:asciiTheme="minorHAnsi" w:eastAsiaTheme="minorEastAsia" w:hAnsiTheme="minorHAnsi" w:cstheme="minorBidi"/>
-                <w:color w:val="000000" w:themeColor="text1"/>
-                <w:lang w:eastAsia="es-CL"/>
-              </w:rPr>
-              <w:t>, las conclusiones y la reflexión en inglés con ideas completas que se conectan en secuencia lógica, utilizando estructuras gramaticales y vocabulario en forma correcta y pertinente al tema a un nivel intermedio alto.</w:t>
+              <w:t>Redacta el abstract, las conclusiones y la reflexión en inglés con ideas completas que se conectan en secuencia lógica, utilizando estructuras gramaticales y vocabulario en forma correcta y pertinente al tema a un nivel intermedio alto.</w:t>
             </w:r>
           </w:p>
         </w:tc>
@@ -3367,7 +3291,6 @@
                 <w:lang w:val="es-ES"/>
               </w:rPr>
             </w:pPr>
-            <w:proofErr w:type="spellStart"/>
             <w:r>
               <w:rPr>
                 <w:rStyle w:val="normaltextrun"/>
@@ -3377,19 +3300,7 @@
                 <w:szCs w:val="22"/>
                 <w:lang w:val="es-CL"/>
               </w:rPr>
-              <w:t>Abstract</w:t>
-            </w:r>
-            <w:proofErr w:type="spellEnd"/>
-            <w:r>
-              <w:rPr>
-                <w:rStyle w:val="normaltextrun"/>
-                <w:rFonts w:ascii="Calibri" w:eastAsia="Calibri" w:hAnsi="Calibri" w:cs="Calibri"/>
-                <w:color w:val="000000" w:themeColor="text1"/>
-                <w:sz w:val="22"/>
-                <w:szCs w:val="22"/>
-                <w:lang w:val="es-CL"/>
-              </w:rPr>
-              <w:t xml:space="preserve"> (inglés y español) </w:t>
+              <w:t>Abstract (inglés y español) </w:t>
             </w:r>
           </w:p>
           <w:p>
@@ -4195,25 +4106,7 @@
                 <w:sz w:val="22"/>
                 <w:szCs w:val="22"/>
               </w:rPr>
-              <w:t xml:space="preserve"> diseño del Proyecto APT </w:t>
-            </w:r>
-            <w:proofErr w:type="gramStart"/>
-            <w:r>
-              <w:rPr>
-                <w:rFonts w:asciiTheme="minorHAnsi" w:eastAsiaTheme="minorEastAsia" w:hAnsiTheme="minorHAnsi" w:cstheme="minorBidi"/>
-                <w:sz w:val="22"/>
-                <w:szCs w:val="22"/>
-              </w:rPr>
-              <w:t>de acuerdo a</w:t>
-            </w:r>
-            <w:proofErr w:type="gramEnd"/>
-            <w:r>
-              <w:rPr>
-                <w:rFonts w:asciiTheme="minorHAnsi" w:eastAsiaTheme="minorEastAsia" w:hAnsiTheme="minorHAnsi" w:cstheme="minorBidi"/>
-                <w:sz w:val="22"/>
-                <w:szCs w:val="22"/>
-              </w:rPr>
-              <w:t xml:space="preserve"> estándares definidos por la disciplina”, deberás revisar si tu Definición de Proyecto APT cumple con los indicadores de calidad disciplinarios, propios de las competencias del Perfil de Egreso de la Carrera que están involucradas en tu Proyecto. Para ello, deberás seleccionar de la siguiente tabla aquellos indicadores de calidad propios de cada una de las competencias del perfil de egreso que </w:t>
+              <w:t xml:space="preserve"> diseño del Proyecto APT de acuerdo a estándares definidos por la disciplina”, deberás revisar si tu Definición de Proyecto APT cumple con los indicadores de calidad disciplinarios, propios de las competencias del Perfil de Egreso de la Carrera que están involucradas en tu Proyecto. Para ello, deberás seleccionar de la siguiente tabla aquellos indicadores de calidad propios de cada una de las competencias del perfil de egreso que </w:t>
             </w:r>
             <w:r>
               <w:rPr>
@@ -4542,23 +4435,7 @@
                 <w:rFonts w:asciiTheme="minorHAnsi" w:eastAsiaTheme="minorEastAsia" w:hAnsiTheme="minorHAnsi" w:cstheme="minorBidi"/>
                 <w:color w:val="000000" w:themeColor="text1"/>
               </w:rPr>
-              <w:t xml:space="preserve">1.3 Desarrolla mejoras al producto en base al resultado de </w:t>
-            </w:r>
-            <w:proofErr w:type="gramStart"/>
-            <w:r>
-              <w:rPr>
-                <w:rFonts w:asciiTheme="minorHAnsi" w:eastAsiaTheme="minorEastAsia" w:hAnsiTheme="minorHAnsi" w:cstheme="minorBidi"/>
-                <w:color w:val="000000" w:themeColor="text1"/>
-              </w:rPr>
-              <w:t>las mismas</w:t>
-            </w:r>
-            <w:proofErr w:type="gramEnd"/>
-            <w:r>
-              <w:rPr>
-                <w:rFonts w:asciiTheme="minorHAnsi" w:eastAsiaTheme="minorEastAsia" w:hAnsiTheme="minorHAnsi" w:cstheme="minorBidi"/>
-                <w:color w:val="000000" w:themeColor="text1"/>
-              </w:rPr>
-              <w:t xml:space="preserve">. </w:t>
+              <w:t xml:space="preserve">1.3 Desarrolla mejoras al producto en base al resultado de las mismas. </w:t>
             </w:r>
           </w:p>
         </w:tc>
@@ -4599,27 +4476,7 @@
                 <w:bCs/>
                 <w:color w:val="000000" w:themeColor="text1"/>
               </w:rPr>
-              <w:t xml:space="preserve">Gestionar proyectos informáticos, ofreciendo alternativas para la toma de decisiones </w:t>
-            </w:r>
-            <w:proofErr w:type="gramStart"/>
-            <w:r>
-              <w:rPr>
-                <w:rFonts w:asciiTheme="minorHAnsi" w:eastAsiaTheme="minorEastAsia" w:hAnsiTheme="minorHAnsi" w:cstheme="minorBidi"/>
-                <w:b/>
-                <w:bCs/>
-                <w:color w:val="000000" w:themeColor="text1"/>
-              </w:rPr>
-              <w:t>de acuerdo a</w:t>
-            </w:r>
-            <w:proofErr w:type="gramEnd"/>
-            <w:r>
-              <w:rPr>
-                <w:rFonts w:asciiTheme="minorHAnsi" w:eastAsiaTheme="minorEastAsia" w:hAnsiTheme="minorHAnsi" w:cstheme="minorBidi"/>
-                <w:b/>
-                <w:bCs/>
-                <w:color w:val="000000" w:themeColor="text1"/>
-              </w:rPr>
-              <w:t xml:space="preserve"> los requerimientos de la organización.</w:t>
+              <w:t>Gestionar proyectos informáticos, ofreciendo alternativas para la toma de decisiones de acuerdo a los requerimientos de la organización.</w:t>
             </w:r>
           </w:p>
         </w:tc>
@@ -4647,23 +4504,7 @@
                 <w:rFonts w:asciiTheme="minorHAnsi" w:eastAsiaTheme="minorEastAsia" w:hAnsiTheme="minorHAnsi" w:cstheme="minorBidi"/>
                 <w:color w:val="000000" w:themeColor="text1"/>
               </w:rPr>
-              <w:t xml:space="preserve">2.1 Planifica proyectos informáticos, ofreciendo alternativas para la toma de decisiones </w:t>
-            </w:r>
-            <w:proofErr w:type="gramStart"/>
-            <w:r>
-              <w:rPr>
-                <w:rFonts w:asciiTheme="minorHAnsi" w:eastAsiaTheme="minorEastAsia" w:hAnsiTheme="minorHAnsi" w:cstheme="minorBidi"/>
-                <w:color w:val="000000" w:themeColor="text1"/>
-              </w:rPr>
-              <w:t>de acuerdo a</w:t>
-            </w:r>
-            <w:proofErr w:type="gramEnd"/>
-            <w:r>
-              <w:rPr>
-                <w:rFonts w:asciiTheme="minorHAnsi" w:eastAsiaTheme="minorEastAsia" w:hAnsiTheme="minorHAnsi" w:cstheme="minorBidi"/>
-                <w:color w:val="000000" w:themeColor="text1"/>
-              </w:rPr>
-              <w:t xml:space="preserve"> los requerimientos de la organización.</w:t>
+              <w:t>2.1 Planifica proyectos informáticos, ofreciendo alternativas para la toma de decisiones de acuerdo a los requerimientos de la organización.</w:t>
             </w:r>
           </w:p>
         </w:tc>
@@ -4704,23 +4545,7 @@
                 <w:rFonts w:asciiTheme="minorHAnsi" w:eastAsiaTheme="minorEastAsia" w:hAnsiTheme="minorHAnsi" w:cstheme="minorBidi"/>
                 <w:color w:val="000000" w:themeColor="text1"/>
               </w:rPr>
-              <w:t xml:space="preserve">2.2 Controla proyectos informáticos, ofreciendo alternativas para la toma de decisiones </w:t>
-            </w:r>
-            <w:proofErr w:type="gramStart"/>
-            <w:r>
-              <w:rPr>
-                <w:rFonts w:asciiTheme="minorHAnsi" w:eastAsiaTheme="minorEastAsia" w:hAnsiTheme="minorHAnsi" w:cstheme="minorBidi"/>
-                <w:color w:val="000000" w:themeColor="text1"/>
-              </w:rPr>
-              <w:t>de acuerdo a</w:t>
-            </w:r>
-            <w:proofErr w:type="gramEnd"/>
-            <w:r>
-              <w:rPr>
-                <w:rFonts w:asciiTheme="minorHAnsi" w:eastAsiaTheme="minorEastAsia" w:hAnsiTheme="minorHAnsi" w:cstheme="minorBidi"/>
-                <w:color w:val="000000" w:themeColor="text1"/>
-              </w:rPr>
-              <w:t xml:space="preserve"> los requerimientos de la organización.</w:t>
+              <w:t>2.2 Controla proyectos informáticos, ofreciendo alternativas para la toma de decisiones de acuerdo a los requerimientos de la organización.</w:t>
             </w:r>
           </w:p>
         </w:tc>
@@ -4761,27 +4586,7 @@
                 <w:bCs/>
                 <w:color w:val="000000" w:themeColor="text1"/>
               </w:rPr>
-              <w:t xml:space="preserve">Construir modelos de datos para soportar los requerimientos de la organización </w:t>
-            </w:r>
-            <w:proofErr w:type="gramStart"/>
-            <w:r>
-              <w:rPr>
-                <w:rFonts w:asciiTheme="minorHAnsi" w:eastAsiaTheme="minorEastAsia" w:hAnsiTheme="minorHAnsi" w:cstheme="minorBidi"/>
-                <w:b/>
-                <w:bCs/>
-                <w:color w:val="000000" w:themeColor="text1"/>
-              </w:rPr>
-              <w:t>de acuerdo a</w:t>
-            </w:r>
-            <w:proofErr w:type="gramEnd"/>
-            <w:r>
-              <w:rPr>
-                <w:rFonts w:asciiTheme="minorHAnsi" w:eastAsiaTheme="minorEastAsia" w:hAnsiTheme="minorHAnsi" w:cstheme="minorBidi"/>
-                <w:b/>
-                <w:bCs/>
-                <w:color w:val="000000" w:themeColor="text1"/>
-              </w:rPr>
-              <w:t xml:space="preserve"> un diseño definido y escalable en el tiempo.</w:t>
+              <w:t>Construir modelos de datos para soportar los requerimientos de la organización de acuerdo a un diseño definido y escalable en el tiempo.</w:t>
             </w:r>
           </w:p>
         </w:tc>
@@ -4809,23 +4614,7 @@
                 <w:rFonts w:asciiTheme="minorHAnsi" w:eastAsiaTheme="minorEastAsia" w:hAnsiTheme="minorHAnsi" w:cstheme="minorBidi"/>
                 <w:color w:val="000000" w:themeColor="text1"/>
               </w:rPr>
-              <w:t xml:space="preserve">3.1 Diseña modelos de datos para soportar los requerimientos de la organización </w:t>
-            </w:r>
-            <w:proofErr w:type="gramStart"/>
-            <w:r>
-              <w:rPr>
-                <w:rFonts w:asciiTheme="minorHAnsi" w:eastAsiaTheme="minorEastAsia" w:hAnsiTheme="minorHAnsi" w:cstheme="minorBidi"/>
-                <w:color w:val="000000" w:themeColor="text1"/>
-              </w:rPr>
-              <w:t>de acuerdo a</w:t>
-            </w:r>
-            <w:proofErr w:type="gramEnd"/>
-            <w:r>
-              <w:rPr>
-                <w:rFonts w:asciiTheme="minorHAnsi" w:eastAsiaTheme="minorEastAsia" w:hAnsiTheme="minorHAnsi" w:cstheme="minorBidi"/>
-                <w:color w:val="000000" w:themeColor="text1"/>
-              </w:rPr>
-              <w:t xml:space="preserve"> un diseño definido y escalable en el tiempo.</w:t>
+              <w:t>3.1 Diseña modelos de datos para soportar los requerimientos de la organización de acuerdo a un diseño definido y escalable en el tiempo.</w:t>
             </w:r>
           </w:p>
         </w:tc>
@@ -4866,23 +4655,7 @@
                 <w:rFonts w:asciiTheme="minorHAnsi" w:eastAsiaTheme="minorEastAsia" w:hAnsiTheme="minorHAnsi" w:cstheme="minorBidi"/>
                 <w:color w:val="000000" w:themeColor="text1"/>
               </w:rPr>
-              <w:t xml:space="preserve">3.2 Implementa modelos de datos para soportar los requerimientos de la organización </w:t>
-            </w:r>
-            <w:proofErr w:type="gramStart"/>
-            <w:r>
-              <w:rPr>
-                <w:rFonts w:asciiTheme="minorHAnsi" w:eastAsiaTheme="minorEastAsia" w:hAnsiTheme="minorHAnsi" w:cstheme="minorBidi"/>
-                <w:color w:val="000000" w:themeColor="text1"/>
-              </w:rPr>
-              <w:t>de acuerdo a</w:t>
-            </w:r>
-            <w:proofErr w:type="gramEnd"/>
-            <w:r>
-              <w:rPr>
-                <w:rFonts w:asciiTheme="minorHAnsi" w:eastAsiaTheme="minorEastAsia" w:hAnsiTheme="minorHAnsi" w:cstheme="minorBidi"/>
-                <w:color w:val="000000" w:themeColor="text1"/>
-              </w:rPr>
-              <w:t xml:space="preserve"> un diseño definido y escalable en el tiempo.</w:t>
+              <w:t>3.2 Implementa modelos de datos para soportar los requerimientos de la organización de acuerdo a un diseño definido y escalable en el tiempo.</w:t>
             </w:r>
           </w:p>
         </w:tc>
@@ -6427,7 +6200,11 @@
           </w:tcPr>
           <w:p>
             <w:r>
-              <w:t xml:space="preserve">[X] Describí una relación coherente entre mi proyecto y el perfil de egreso de mi plan de estudio, especificando cómo debo utilizar distintas competencias para desarrollar mi Proyecto APT. </w:t>
+              <w:t xml:space="preserve">[X] Describí una relación coherente entre mi proyecto y el perfil de egreso de mi plan de estudio, especificando cómo debo utilizar </w:t>
+            </w:r>
+            <w:r>
+              <w:lastRenderedPageBreak/>
+              <w:t xml:space="preserve">distintas competencias para desarrollar mi Proyecto APT. </w:t>
             </w:r>
           </w:p>
         </w:tc>
@@ -7069,8 +6846,12 @@
           <w:p>
             <w:r>
               <w:t>[X] Justifiqué por qué el proyecto puede desarrollarse, considerando el tiempo y materiales o factores externos</w:t>
+            </w:r>
+            <w:r>
               <w:br/>
               <w:t>Y</w:t>
+            </w:r>
+            <w:r>
               <w:br/>
               <w:t>En caso de posibles dificultades no plantee claramente como las abordaría.</w:t>
             </w:r>
@@ -7309,23 +7090,7 @@
                 <w:rFonts w:asciiTheme="minorHAnsi" w:eastAsiaTheme="minorEastAsia" w:hAnsiTheme="minorHAnsi" w:cstheme="minorBidi"/>
                 <w:color w:val="000000" w:themeColor="text1"/>
               </w:rPr>
-              <w:t xml:space="preserve">objetivos claros y coherentes con la situación a abordar, pero imprecisos </w:t>
-            </w:r>
-            <w:proofErr w:type="gramStart"/>
-            <w:r>
-              <w:rPr>
-                <w:rFonts w:asciiTheme="minorHAnsi" w:eastAsiaTheme="minorEastAsia" w:hAnsiTheme="minorHAnsi" w:cstheme="minorBidi"/>
-                <w:color w:val="000000" w:themeColor="text1"/>
-              </w:rPr>
-              <w:t>de acuerdo a</w:t>
-            </w:r>
-            <w:proofErr w:type="gramEnd"/>
-            <w:r>
-              <w:rPr>
-                <w:rFonts w:asciiTheme="minorHAnsi" w:eastAsiaTheme="minorEastAsia" w:hAnsiTheme="minorHAnsi" w:cstheme="minorBidi"/>
-                <w:color w:val="000000" w:themeColor="text1"/>
-              </w:rPr>
-              <w:t xml:space="preserve"> la disciplina. </w:t>
+              <w:t xml:space="preserve">objetivos claros y coherentes con la situación a abordar, pero imprecisos de acuerdo a la disciplina. </w:t>
             </w:r>
           </w:p>
         </w:tc>
@@ -7614,7 +7379,7 @@
                 <w:color w:val="000000" w:themeColor="text1"/>
                 <w:lang w:eastAsia="es-CL"/>
               </w:rPr>
-              <w:t xml:space="preserve">7. Establece un plan de trabajo para su proyecto APT </w:t>
+              <w:t xml:space="preserve">7. Establece un plan de trabajo para su proyecto APT considerando los recursos, </w:t>
             </w:r>
             <w:r>
               <w:rPr>
@@ -7623,7 +7388,7 @@
                 <w:lang w:eastAsia="es-CL"/>
               </w:rPr>
               <w:lastRenderedPageBreak/>
-              <w:t>considerando los recursos, duración, facilitadores y obstaculizadores en el desarrollo de las actividades</w:t>
+              <w:t>duración, facilitadores y obstaculizadores en el desarrollo de las actividades</w:t>
             </w:r>
             <w:r>
               <w:rPr>
@@ -7677,7 +7442,7 @@
                 <w:rFonts w:asciiTheme="minorHAnsi" w:eastAsiaTheme="minorEastAsia" w:hAnsiTheme="minorHAnsi" w:cstheme="minorBidi"/>
                 <w:color w:val="000000" w:themeColor="text1"/>
               </w:rPr>
-              <w:t xml:space="preserve"> un plan de trabajo con todas las </w:t>
+              <w:t xml:space="preserve"> un plan de trabajo con todas las actividades necesarias </w:t>
             </w:r>
             <w:r>
               <w:rPr>
@@ -7685,7 +7450,7 @@
                 <w:color w:val="000000" w:themeColor="text1"/>
               </w:rPr>
               <w:lastRenderedPageBreak/>
-              <w:t xml:space="preserve">actividades necesarias para cumplir </w:t>
+              <w:t xml:space="preserve">para cumplir </w:t>
             </w:r>
             <w:r>
               <w:rPr>
@@ -7710,7 +7475,12 @@
           </w:tcPr>
           <w:p>
             <w:r>
-              <w:t xml:space="preserve">[X] Establecí un plan de trabajo con la mayoría de las actividades necesarias para cumplir mis objetivos, teniendo en consideración los recursos, duración, facilitadores y obstaculizadores. </w:t>
+              <w:lastRenderedPageBreak/>
+              <w:t xml:space="preserve">[X] Establecí un plan de trabajo con la mayoría de las actividades necesarias </w:t>
+            </w:r>
+            <w:r>
+              <w:lastRenderedPageBreak/>
+              <w:t xml:space="preserve">para cumplir mis objetivos, teniendo en consideración los recursos, duración, facilitadores y obstaculizadores. </w:t>
             </w:r>
           </w:p>
         </w:tc>
@@ -7740,7 +7510,7 @@
                 <w:rFonts w:asciiTheme="minorHAnsi" w:eastAsiaTheme="minorEastAsia" w:hAnsiTheme="minorHAnsi" w:cstheme="minorBidi"/>
                 <w:color w:val="000000" w:themeColor="text1"/>
               </w:rPr>
-              <w:t xml:space="preserve">un plan de trabajo que carece de </w:t>
+              <w:t xml:space="preserve">un plan de trabajo que carece de actividades necesarias </w:t>
             </w:r>
             <w:r>
               <w:rPr>
@@ -7748,7 +7518,7 @@
                 <w:color w:val="000000" w:themeColor="text1"/>
               </w:rPr>
               <w:lastRenderedPageBreak/>
-              <w:t xml:space="preserve">actividades necesarias para cumplir </w:t>
+              <w:t xml:space="preserve">para cumplir </w:t>
             </w:r>
             <w:r>
               <w:rPr>
@@ -7799,7 +7569,21 @@
                 <w:rFonts w:asciiTheme="minorHAnsi" w:eastAsiaTheme="minorEastAsia" w:hAnsiTheme="minorHAnsi" w:cstheme="minorBidi"/>
                 <w:color w:val="000000" w:themeColor="text1"/>
               </w:rPr>
-              <w:t xml:space="preserve"> un plan de trabajo, o bien este </w:t>
+              <w:t xml:space="preserve"> un plan de trabajo, o bien este no </w:t>
+            </w:r>
+            <w:r>
+              <w:rPr>
+                <w:rFonts w:asciiTheme="minorHAnsi" w:eastAsiaTheme="minorEastAsia" w:hAnsiTheme="minorHAnsi" w:cstheme="minorBidi"/>
+                <w:color w:val="000000" w:themeColor="text1"/>
+              </w:rPr>
+              <w:t>permite</w:t>
+            </w:r>
+            <w:r>
+              <w:rPr>
+                <w:rFonts w:asciiTheme="minorHAnsi" w:eastAsiaTheme="minorEastAsia" w:hAnsiTheme="minorHAnsi" w:cstheme="minorBidi"/>
+                <w:color w:val="000000" w:themeColor="text1"/>
+              </w:rPr>
+              <w:t xml:space="preserve"> cumplir </w:t>
             </w:r>
             <w:r>
               <w:rPr>
@@ -7807,21 +7591,7 @@
                 <w:color w:val="000000" w:themeColor="text1"/>
               </w:rPr>
               <w:lastRenderedPageBreak/>
-              <w:t xml:space="preserve">no </w:t>
-            </w:r>
-            <w:r>
-              <w:rPr>
-                <w:rFonts w:asciiTheme="minorHAnsi" w:eastAsiaTheme="minorEastAsia" w:hAnsiTheme="minorHAnsi" w:cstheme="minorBidi"/>
-                <w:color w:val="000000" w:themeColor="text1"/>
-              </w:rPr>
-              <w:t>permite</w:t>
-            </w:r>
-            <w:r>
-              <w:rPr>
-                <w:rFonts w:asciiTheme="minorHAnsi" w:eastAsiaTheme="minorEastAsia" w:hAnsiTheme="minorHAnsi" w:cstheme="minorBidi"/>
-                <w:color w:val="000000" w:themeColor="text1"/>
-              </w:rPr>
-              <w:t xml:space="preserve"> cumplir los objetivos de</w:t>
+              <w:t>los objetivos de</w:t>
             </w:r>
             <w:r>
               <w:rPr>
@@ -8149,8 +7919,12 @@
           <w:p>
             <w:r>
               <w:t>[X] El texto cumple con las reglas ortografía y de redacción en todos sus apartados.</w:t>
+            </w:r>
+            <w:r>
               <w:br/>
               <w:t>Y</w:t>
+            </w:r>
+            <w:r>
               <w:br/>
               <w:t>Utilicé correctamente todas las normas de citación y referencias.</w:t>
             </w:r>
@@ -8431,25 +8205,7 @@
                 <w:color w:val="000000" w:themeColor="text1"/>
                 <w:lang w:eastAsia="es-CL"/>
               </w:rPr>
-              <w:t xml:space="preserve"> diseño del Proyecto APT </w:t>
-            </w:r>
-            <w:proofErr w:type="gramStart"/>
-            <w:r>
-              <w:rPr>
-                <w:rFonts w:asciiTheme="minorHAnsi" w:eastAsiaTheme="minorEastAsia" w:hAnsiTheme="minorHAnsi" w:cstheme="minorBidi"/>
-                <w:color w:val="000000" w:themeColor="text1"/>
-                <w:lang w:eastAsia="es-CL"/>
-              </w:rPr>
-              <w:t>de acuerdo a</w:t>
-            </w:r>
-            <w:proofErr w:type="gramEnd"/>
-            <w:r>
-              <w:rPr>
-                <w:rFonts w:asciiTheme="minorHAnsi" w:eastAsiaTheme="minorEastAsia" w:hAnsiTheme="minorHAnsi" w:cstheme="minorBidi"/>
-                <w:color w:val="000000" w:themeColor="text1"/>
-                <w:lang w:eastAsia="es-CL"/>
-              </w:rPr>
-              <w:t xml:space="preserve"> estándares definidos por la disciplina.</w:t>
+              <w:t xml:space="preserve"> diseño del Proyecto APT de acuerdo a estándares definidos por la disciplina.</w:t>
             </w:r>
           </w:p>
         </w:tc>
@@ -8595,35 +8351,7 @@
                 <w:color w:val="000000" w:themeColor="text1"/>
                 <w:lang w:eastAsia="es-CL"/>
               </w:rPr>
-              <w:t xml:space="preserve">12.  </w:t>
-            </w:r>
-            <w:r>
-              <w:rPr>
-                <w:rFonts w:asciiTheme="minorHAnsi" w:eastAsiaTheme="minorEastAsia" w:hAnsiTheme="minorHAnsi" w:cstheme="minorBidi"/>
-                <w:color w:val="000000" w:themeColor="text1"/>
-                <w:lang w:eastAsia="es-CL"/>
-              </w:rPr>
-              <w:t xml:space="preserve">Redacta el </w:t>
-            </w:r>
-            <w:proofErr w:type="spellStart"/>
-            <w:proofErr w:type="gramStart"/>
-            <w:r>
-              <w:rPr>
-                <w:rFonts w:asciiTheme="minorHAnsi" w:eastAsiaTheme="minorEastAsia" w:hAnsiTheme="minorHAnsi" w:cstheme="minorBidi"/>
-                <w:color w:val="000000" w:themeColor="text1"/>
-                <w:lang w:eastAsia="es-CL"/>
-              </w:rPr>
-              <w:t>abstract</w:t>
-            </w:r>
-            <w:proofErr w:type="spellEnd"/>
-            <w:proofErr w:type="gramEnd"/>
-            <w:r>
-              <w:rPr>
-                <w:rFonts w:asciiTheme="minorHAnsi" w:eastAsiaTheme="minorEastAsia" w:hAnsiTheme="minorHAnsi" w:cstheme="minorBidi"/>
-                <w:color w:val="000000" w:themeColor="text1"/>
-                <w:lang w:eastAsia="es-CL"/>
-              </w:rPr>
-              <w:t xml:space="preserve">, las conclusiones y la reflexión en inglés con ideas completas que se conectan en secuencia lógica, </w:t>
+              <w:t xml:space="preserve">12.  Redacta el abstract, las conclusiones y la reflexión en inglés con ideas completas que se conectan en secuencia lógica, utilizando estructuras gramaticales y vocabulario en </w:t>
             </w:r>
             <w:r>
               <w:rPr>
@@ -8632,7 +8360,7 @@
                 <w:lang w:eastAsia="es-CL"/>
               </w:rPr>
               <w:lastRenderedPageBreak/>
-              <w:t>utilizando estructuras gramaticales y vocabulario en forma correcta y pertinente al tema a un nivel intermedio alto.</w:t>
+              <w:t>forma correcta y pertinente al tema a un nivel intermedio alto.</w:t>
             </w:r>
           </w:p>
           <w:p>
@@ -8669,14 +8397,14 @@
                 <w:rFonts w:asciiTheme="minorHAnsi" w:hAnsiTheme="minorHAnsi" w:cstheme="minorHAnsi"/>
               </w:rPr>
               <w:lastRenderedPageBreak/>
-              <w:t xml:space="preserve">Redacta los textos en inglés siguiendo una secuencia lógica en la que todas las oraciones </w:t>
+              <w:t xml:space="preserve">Redacta los textos en inglés siguiendo una secuencia lógica en la que todas las oraciones se conectan de manera fluida y comprensible,  utilizando en forma </w:t>
             </w:r>
             <w:r>
               <w:rPr>
                 <w:rFonts w:asciiTheme="minorHAnsi" w:hAnsiTheme="minorHAnsi" w:cstheme="minorHAnsi"/>
               </w:rPr>
               <w:lastRenderedPageBreak/>
-              <w:t>se conectan de manera fluida y comprensible,  utilizando en forma correcta las estructuras gramaticales y el vocabulario pertinentes al tema.</w:t>
+              <w:t>correcta las estructuras gramaticales y el vocabulario pertinentes al tema.</w:t>
             </w:r>
           </w:p>
         </w:tc>
@@ -8687,7 +8415,12 @@
           </w:tcPr>
           <w:p>
             <w:r>
-              <w:t>[X] Redacta los textos en inglés siguiendo una secuencia lógica en la que gran parte de las oraciones se conectan de manera fluida y comprensible,  utilizando en forma correcta la mayoría de las estructuras gramaticales y el vocabulario pertinentes al tema.</w:t>
+              <w:lastRenderedPageBreak/>
+              <w:t xml:space="preserve">[X] Redacta los textos en inglés siguiendo una secuencia lógica en la que gran parte de las oraciones se conectan de manera fluida y comprensible,  </w:t>
+            </w:r>
+            <w:r>
+              <w:lastRenderedPageBreak/>
+              <w:t>utilizando en forma correcta la mayoría de las estructuras gramaticales y el vocabulario pertinentes al tema.</w:t>
             </w:r>
           </w:p>
         </w:tc>
@@ -8708,14 +8441,14 @@
                 <w:rFonts w:asciiTheme="minorHAnsi" w:hAnsiTheme="minorHAnsi" w:cstheme="minorHAnsi"/>
               </w:rPr>
               <w:lastRenderedPageBreak/>
-              <w:t xml:space="preserve">Redacta los textos en inglés usando una secuencia limitada o desorganizada que </w:t>
+              <w:t xml:space="preserve">Redacta los textos en inglés usando una secuencia limitada o desorganizada que dificulta la comprensión de las ideas,  utilizando </w:t>
             </w:r>
             <w:r>
               <w:rPr>
                 <w:rFonts w:asciiTheme="minorHAnsi" w:hAnsiTheme="minorHAnsi" w:cstheme="minorHAnsi"/>
               </w:rPr>
               <w:lastRenderedPageBreak/>
-              <w:t>dificulta la comprensión de las ideas,  utilizando inadecuadamente las estructuras gramaticales y el vocabulario pertinentes al tema.</w:t>
+              <w:t>inadecuadamente las estructuras gramaticales y el vocabulario pertinentes al tema.</w:t>
             </w:r>
           </w:p>
         </w:tc>
@@ -8748,14 +8481,14 @@
               <w:rPr>
                 <w:rFonts w:asciiTheme="minorHAnsi" w:hAnsiTheme="minorHAnsi" w:cstheme="minorHAnsi"/>
               </w:rPr>
-              <w:t xml:space="preserve">o escribe frases sueltas que no se </w:t>
+              <w:t xml:space="preserve">o escribe frases sueltas que no se relacionan entre ellas impidiendo la </w:t>
             </w:r>
             <w:r>
               <w:rPr>
                 <w:rFonts w:asciiTheme="minorHAnsi" w:hAnsiTheme="minorHAnsi" w:cstheme="minorHAnsi"/>
               </w:rPr>
               <w:lastRenderedPageBreak/>
-              <w:t xml:space="preserve">relacionan entre ellas impidiendo la comprensión de las ideas, </w:t>
+              <w:t xml:space="preserve">comprensión de las ideas, </w:t>
             </w:r>
           </w:p>
           <w:p>
@@ -8864,6 +8597,1444 @@
         </w:tc>
       </w:tr>
     </w:tbl>
+    <w:p>
+      <w:pPr>
+        <w:rPr>
+          <w:rFonts w:asciiTheme="minorHAnsi" w:eastAsiaTheme="minorEastAsia" w:hAnsiTheme="minorHAnsi" w:cstheme="minorBidi"/>
+          <w:color w:val="000000"/>
+          <w:sz w:val="22"/>
+          <w:szCs w:val="22"/>
+          <w:u w:val="single"/>
+        </w:rPr>
+      </w:pPr>
+    </w:p>
+    <w:p>
+      <w:pPr>
+        <w:rPr>
+          <w:rFonts w:asciiTheme="minorHAnsi" w:eastAsiaTheme="minorEastAsia" w:hAnsiTheme="minorHAnsi" w:cstheme="minorBidi"/>
+          <w:color w:val="000000"/>
+          <w:sz w:val="22"/>
+          <w:szCs w:val="22"/>
+          <w:u w:val="single"/>
+        </w:rPr>
+      </w:pPr>
+    </w:p>
+    <w:p>
+      <w:pPr>
+        <w:rPr>
+          <w:rFonts w:asciiTheme="minorHAnsi" w:eastAsiaTheme="minorEastAsia" w:hAnsiTheme="minorHAnsi" w:cstheme="minorBidi"/>
+          <w:color w:val="000000"/>
+          <w:sz w:val="22"/>
+          <w:szCs w:val="22"/>
+          <w:u w:val="single"/>
+        </w:rPr>
+      </w:pPr>
+    </w:p>
+    <w:p>
+      <w:pPr>
+        <w:rPr>
+          <w:rFonts w:asciiTheme="minorHAnsi" w:eastAsiaTheme="minorEastAsia" w:hAnsiTheme="minorHAnsi" w:cstheme="minorBidi"/>
+          <w:color w:val="000000"/>
+          <w:sz w:val="22"/>
+          <w:szCs w:val="22"/>
+          <w:u w:val="single"/>
+        </w:rPr>
+      </w:pPr>
+    </w:p>
+    <w:p>
+      <w:pPr>
+        <w:rPr>
+          <w:rFonts w:asciiTheme="minorHAnsi" w:eastAsiaTheme="minorEastAsia" w:hAnsiTheme="minorHAnsi" w:cstheme="minorBidi"/>
+          <w:color w:val="000000"/>
+          <w:sz w:val="22"/>
+          <w:szCs w:val="22"/>
+          <w:u w:val="single"/>
+        </w:rPr>
+      </w:pPr>
+      <w:r>
+        <w:rPr>
+          <w:rFonts w:asciiTheme="minorHAnsi" w:eastAsiaTheme="minorEastAsia" w:hAnsiTheme="minorHAnsi" w:cstheme="minorBidi"/>
+          <w:b/>
+          <w:color w:val="000000"/>
+          <w:sz w:val="22"/>
+          <w:szCs w:val="22"/>
+          <w:u w:val="single"/>
+        </w:rPr>
+        <w:t>Justificación de mi autoevaluación</w:t>
+      </w:r>
+    </w:p>
+    <w:tbl>
+      <w:tblPr>
+        <w:tblStyle w:val="Tablaconcuadrculaclara"/>
+        <w:tblW w:w="9645" w:type="dxa"/>
+        <w:tblLayout w:type="fixed"/>
+        <w:tblLook w:val="04A0" w:firstRow="1" w:lastRow="0" w:firstColumn="1" w:lastColumn="0" w:noHBand="0" w:noVBand="1"/>
+      </w:tblPr>
+      <w:tblGrid>
+        <w:gridCol w:w="2043"/>
+        <w:gridCol w:w="1702"/>
+        <w:gridCol w:w="5900"/>
+      </w:tblGrid>
+      <w:tr>
+        <w:tc>
+          <w:tcPr>
+            <w:tcW w:w="2041" w:type="dxa"/>
+            <w:tcBorders>
+              <w:top w:val="single" w:sz="4" w:space="0" w:color="BFBFBF" w:themeColor="background1" w:themeShade="BF"/>
+              <w:left w:val="single" w:sz="4" w:space="0" w:color="BFBFBF" w:themeColor="background1" w:themeShade="BF"/>
+              <w:bottom w:val="single" w:sz="4" w:space="0" w:color="BFBFBF" w:themeColor="background1" w:themeShade="BF"/>
+              <w:right w:val="single" w:sz="4" w:space="0" w:color="BFBFBF" w:themeColor="background1" w:themeShade="BF"/>
+            </w:tcBorders>
+            <w:hideMark/>
+          </w:tcPr>
+          <w:p>
+            <w:pPr>
+              <w:rPr>
+                <w:rFonts w:asciiTheme="minorHAnsi" w:eastAsiaTheme="minorEastAsia" w:hAnsiTheme="minorHAnsi" w:cstheme="minorBidi"/>
+                <w:color w:val="000000"/>
+                <w:sz w:val="22"/>
+                <w:szCs w:val="22"/>
+                <w:u w:val="single"/>
+              </w:rPr>
+            </w:pPr>
+            <w:r>
+              <w:rPr>
+                <w:rFonts w:asciiTheme="minorHAnsi" w:eastAsiaTheme="minorEastAsia" w:hAnsiTheme="minorHAnsi" w:cstheme="minorBidi"/>
+                <w:b/>
+                <w:color w:val="000000"/>
+                <w:sz w:val="22"/>
+                <w:szCs w:val="22"/>
+                <w:u w:val="single"/>
+              </w:rPr>
+              <w:t>Indicador</w:t>
+            </w:r>
+          </w:p>
+        </w:tc>
+        <w:tc>
+          <w:tcPr>
+            <w:tcW w:w="1701" w:type="dxa"/>
+            <w:tcBorders>
+              <w:top w:val="single" w:sz="4" w:space="0" w:color="BFBFBF" w:themeColor="background1" w:themeShade="BF"/>
+              <w:left w:val="single" w:sz="4" w:space="0" w:color="BFBFBF" w:themeColor="background1" w:themeShade="BF"/>
+              <w:bottom w:val="single" w:sz="4" w:space="0" w:color="BFBFBF" w:themeColor="background1" w:themeShade="BF"/>
+              <w:right w:val="single" w:sz="4" w:space="0" w:color="BFBFBF" w:themeColor="background1" w:themeShade="BF"/>
+            </w:tcBorders>
+            <w:hideMark/>
+          </w:tcPr>
+          <w:p>
+            <w:pPr>
+              <w:rPr>
+                <w:rFonts w:asciiTheme="minorHAnsi" w:eastAsiaTheme="minorEastAsia" w:hAnsiTheme="minorHAnsi" w:cstheme="minorBidi"/>
+                <w:color w:val="000000"/>
+                <w:sz w:val="22"/>
+                <w:szCs w:val="22"/>
+                <w:u w:val="single"/>
+              </w:rPr>
+            </w:pPr>
+            <w:r>
+              <w:rPr>
+                <w:rFonts w:asciiTheme="minorHAnsi" w:eastAsiaTheme="minorEastAsia" w:hAnsiTheme="minorHAnsi" w:cstheme="minorBidi"/>
+                <w:b/>
+                <w:color w:val="000000"/>
+                <w:sz w:val="22"/>
+                <w:szCs w:val="22"/>
+                <w:u w:val="single"/>
+              </w:rPr>
+              <w:t>Nivel</w:t>
+            </w:r>
+          </w:p>
+        </w:tc>
+        <w:tc>
+          <w:tcPr>
+            <w:tcW w:w="5896" w:type="dxa"/>
+            <w:tcBorders>
+              <w:top w:val="single" w:sz="4" w:space="0" w:color="BFBFBF" w:themeColor="background1" w:themeShade="BF"/>
+              <w:left w:val="single" w:sz="4" w:space="0" w:color="BFBFBF" w:themeColor="background1" w:themeShade="BF"/>
+              <w:bottom w:val="single" w:sz="4" w:space="0" w:color="BFBFBF" w:themeColor="background1" w:themeShade="BF"/>
+              <w:right w:val="single" w:sz="4" w:space="0" w:color="BFBFBF" w:themeColor="background1" w:themeShade="BF"/>
+            </w:tcBorders>
+            <w:hideMark/>
+          </w:tcPr>
+          <w:p>
+            <w:pPr>
+              <w:rPr>
+                <w:rFonts w:asciiTheme="minorHAnsi" w:eastAsiaTheme="minorEastAsia" w:hAnsiTheme="minorHAnsi" w:cstheme="minorBidi"/>
+                <w:color w:val="000000"/>
+                <w:sz w:val="22"/>
+                <w:szCs w:val="22"/>
+                <w:u w:val="single"/>
+              </w:rPr>
+            </w:pPr>
+            <w:r>
+              <w:rPr>
+                <w:rFonts w:asciiTheme="minorHAnsi" w:eastAsiaTheme="minorEastAsia" w:hAnsiTheme="minorHAnsi" w:cstheme="minorBidi"/>
+                <w:b/>
+                <w:color w:val="000000"/>
+                <w:sz w:val="22"/>
+                <w:szCs w:val="22"/>
+                <w:u w:val="single"/>
+              </w:rPr>
+              <w:t>Justificación</w:t>
+            </w:r>
+          </w:p>
+        </w:tc>
+      </w:tr>
+      <w:tr>
+        <w:tc>
+          <w:tcPr>
+            <w:tcW w:w="2041" w:type="dxa"/>
+            <w:tcBorders>
+              <w:top w:val="single" w:sz="4" w:space="0" w:color="BFBFBF" w:themeColor="background1" w:themeShade="BF"/>
+              <w:left w:val="single" w:sz="4" w:space="0" w:color="BFBFBF" w:themeColor="background1" w:themeShade="BF"/>
+              <w:bottom w:val="single" w:sz="4" w:space="0" w:color="BFBFBF" w:themeColor="background1" w:themeShade="BF"/>
+              <w:right w:val="single" w:sz="4" w:space="0" w:color="BFBFBF" w:themeColor="background1" w:themeShade="BF"/>
+            </w:tcBorders>
+            <w:hideMark/>
+          </w:tcPr>
+          <w:p>
+            <w:pPr>
+              <w:rPr>
+                <w:rFonts w:asciiTheme="minorHAnsi" w:eastAsiaTheme="minorEastAsia" w:hAnsiTheme="minorHAnsi" w:cstheme="minorBidi"/>
+                <w:color w:val="000000"/>
+                <w:sz w:val="22"/>
+                <w:szCs w:val="22"/>
+                <w:u w:val="single"/>
+              </w:rPr>
+            </w:pPr>
+            <w:r>
+              <w:rPr>
+                <w:rFonts w:asciiTheme="minorHAnsi" w:eastAsiaTheme="minorEastAsia" w:hAnsiTheme="minorHAnsi" w:cstheme="minorBidi"/>
+                <w:color w:val="000000"/>
+                <w:sz w:val="22"/>
+                <w:szCs w:val="22"/>
+                <w:u w:val="single"/>
+              </w:rPr>
+              <w:t>1. Descripción del proyecto</w:t>
+            </w:r>
+          </w:p>
+        </w:tc>
+        <w:tc>
+          <w:tcPr>
+            <w:tcW w:w="1701" w:type="dxa"/>
+            <w:tcBorders>
+              <w:top w:val="single" w:sz="4" w:space="0" w:color="BFBFBF" w:themeColor="background1" w:themeShade="BF"/>
+              <w:left w:val="single" w:sz="4" w:space="0" w:color="BFBFBF" w:themeColor="background1" w:themeShade="BF"/>
+              <w:bottom w:val="single" w:sz="4" w:space="0" w:color="BFBFBF" w:themeColor="background1" w:themeShade="BF"/>
+              <w:right w:val="single" w:sz="4" w:space="0" w:color="BFBFBF" w:themeColor="background1" w:themeShade="BF"/>
+            </w:tcBorders>
+            <w:hideMark/>
+          </w:tcPr>
+          <w:p>
+            <w:pPr>
+              <w:rPr>
+                <w:rFonts w:asciiTheme="minorHAnsi" w:eastAsiaTheme="minorEastAsia" w:hAnsiTheme="minorHAnsi" w:cstheme="minorBidi"/>
+                <w:color w:val="000000"/>
+                <w:sz w:val="22"/>
+                <w:szCs w:val="22"/>
+                <w:u w:val="single"/>
+              </w:rPr>
+            </w:pPr>
+            <w:r>
+              <w:rPr>
+                <w:rFonts w:asciiTheme="minorHAnsi" w:eastAsiaTheme="minorEastAsia" w:hAnsiTheme="minorHAnsi" w:cstheme="minorBidi"/>
+                <w:color w:val="000000"/>
+                <w:sz w:val="22"/>
+                <w:szCs w:val="22"/>
+                <w:u w:val="single"/>
+              </w:rPr>
+              <w:t>Completamente logrado</w:t>
+            </w:r>
+          </w:p>
+        </w:tc>
+        <w:tc>
+          <w:tcPr>
+            <w:tcW w:w="5896" w:type="dxa"/>
+            <w:tcBorders>
+              <w:top w:val="single" w:sz="4" w:space="0" w:color="BFBFBF" w:themeColor="background1" w:themeShade="BF"/>
+              <w:left w:val="single" w:sz="4" w:space="0" w:color="BFBFBF" w:themeColor="background1" w:themeShade="BF"/>
+              <w:bottom w:val="single" w:sz="4" w:space="0" w:color="BFBFBF" w:themeColor="background1" w:themeShade="BF"/>
+              <w:right w:val="single" w:sz="4" w:space="0" w:color="BFBFBF" w:themeColor="background1" w:themeShade="BF"/>
+            </w:tcBorders>
+            <w:hideMark/>
+          </w:tcPr>
+          <w:p>
+            <w:pPr>
+              <w:rPr>
+                <w:rFonts w:asciiTheme="minorHAnsi" w:eastAsiaTheme="minorEastAsia" w:hAnsiTheme="minorHAnsi" w:cstheme="minorBidi"/>
+                <w:color w:val="000000"/>
+                <w:sz w:val="22"/>
+                <w:szCs w:val="22"/>
+                <w:u w:val="single"/>
+              </w:rPr>
+            </w:pPr>
+            <w:r>
+              <w:rPr>
+                <w:rFonts w:asciiTheme="minorHAnsi" w:eastAsiaTheme="minorEastAsia" w:hAnsiTheme="minorHAnsi" w:cstheme="minorBidi"/>
+                <w:color w:val="000000"/>
+                <w:sz w:val="22"/>
+                <w:szCs w:val="22"/>
+                <w:u w:val="single"/>
+              </w:rPr>
+              <w:t>Operations Analytics automatiza el proceso SAP FBL1N: extrae y valida la información, consolida las fuentes histórica y vigente, genera la MATRIZ_FBL1N y los reportes en Excel, los publica en SharePoint/OneDrive y notifica por Outlook. Su relevancia laboral es directa: reduce tareas manuales, tiempos de proceso y errores en el equipo de Back Office y Operaciones Comerciales.</w:t>
+            </w:r>
+          </w:p>
+        </w:tc>
+      </w:tr>
+      <w:tr>
+        <w:tc>
+          <w:tcPr>
+            <w:tcW w:w="2041" w:type="dxa"/>
+            <w:tcBorders>
+              <w:top w:val="single" w:sz="4" w:space="0" w:color="BFBFBF" w:themeColor="background1" w:themeShade="BF"/>
+              <w:left w:val="single" w:sz="4" w:space="0" w:color="BFBFBF" w:themeColor="background1" w:themeShade="BF"/>
+              <w:bottom w:val="single" w:sz="4" w:space="0" w:color="BFBFBF" w:themeColor="background1" w:themeShade="BF"/>
+              <w:right w:val="single" w:sz="4" w:space="0" w:color="BFBFBF" w:themeColor="background1" w:themeShade="BF"/>
+            </w:tcBorders>
+            <w:hideMark/>
+          </w:tcPr>
+          <w:p>
+            <w:pPr>
+              <w:rPr>
+                <w:rFonts w:asciiTheme="minorHAnsi" w:eastAsiaTheme="minorEastAsia" w:hAnsiTheme="minorHAnsi" w:cstheme="minorBidi"/>
+                <w:color w:val="000000"/>
+                <w:sz w:val="22"/>
+                <w:szCs w:val="22"/>
+                <w:u w:val="single"/>
+              </w:rPr>
+            </w:pPr>
+            <w:r>
+              <w:rPr>
+                <w:rFonts w:asciiTheme="minorHAnsi" w:eastAsiaTheme="minorEastAsia" w:hAnsiTheme="minorHAnsi" w:cstheme="minorBidi"/>
+                <w:color w:val="000000"/>
+                <w:sz w:val="22"/>
+                <w:szCs w:val="22"/>
+                <w:u w:val="single"/>
+              </w:rPr>
+              <w:t>2. Perfil de egreso</w:t>
+            </w:r>
+          </w:p>
+        </w:tc>
+        <w:tc>
+          <w:tcPr>
+            <w:tcW w:w="1701" w:type="dxa"/>
+            <w:tcBorders>
+              <w:top w:val="single" w:sz="4" w:space="0" w:color="BFBFBF" w:themeColor="background1" w:themeShade="BF"/>
+              <w:left w:val="single" w:sz="4" w:space="0" w:color="BFBFBF" w:themeColor="background1" w:themeShade="BF"/>
+              <w:bottom w:val="single" w:sz="4" w:space="0" w:color="BFBFBF" w:themeColor="background1" w:themeShade="BF"/>
+              <w:right w:val="single" w:sz="4" w:space="0" w:color="BFBFBF" w:themeColor="background1" w:themeShade="BF"/>
+            </w:tcBorders>
+            <w:hideMark/>
+          </w:tcPr>
+          <w:p>
+            <w:pPr>
+              <w:rPr>
+                <w:rFonts w:asciiTheme="minorHAnsi" w:eastAsiaTheme="minorEastAsia" w:hAnsiTheme="minorHAnsi" w:cstheme="minorBidi"/>
+                <w:color w:val="000000"/>
+                <w:sz w:val="22"/>
+                <w:szCs w:val="22"/>
+                <w:u w:val="single"/>
+              </w:rPr>
+            </w:pPr>
+            <w:r>
+              <w:rPr>
+                <w:rFonts w:asciiTheme="minorHAnsi" w:eastAsiaTheme="minorEastAsia" w:hAnsiTheme="minorHAnsi" w:cstheme="minorBidi"/>
+                <w:color w:val="000000"/>
+                <w:sz w:val="22"/>
+                <w:szCs w:val="22"/>
+                <w:u w:val="single"/>
+              </w:rPr>
+              <w:t>Completamente logrado</w:t>
+            </w:r>
+          </w:p>
+        </w:tc>
+        <w:tc>
+          <w:tcPr>
+            <w:tcW w:w="5896" w:type="dxa"/>
+            <w:tcBorders>
+              <w:top w:val="single" w:sz="4" w:space="0" w:color="BFBFBF" w:themeColor="background1" w:themeShade="BF"/>
+              <w:left w:val="single" w:sz="4" w:space="0" w:color="BFBFBF" w:themeColor="background1" w:themeShade="BF"/>
+              <w:bottom w:val="single" w:sz="4" w:space="0" w:color="BFBFBF" w:themeColor="background1" w:themeShade="BF"/>
+              <w:right w:val="single" w:sz="4" w:space="0" w:color="BFBFBF" w:themeColor="background1" w:themeShade="BF"/>
+            </w:tcBorders>
+            <w:hideMark/>
+          </w:tcPr>
+          <w:p>
+            <w:pPr>
+              <w:rPr>
+                <w:rFonts w:asciiTheme="minorHAnsi" w:eastAsiaTheme="minorEastAsia" w:hAnsiTheme="minorHAnsi" w:cstheme="minorBidi"/>
+                <w:color w:val="000000"/>
+                <w:sz w:val="22"/>
+                <w:szCs w:val="22"/>
+                <w:u w:val="single"/>
+              </w:rPr>
+            </w:pPr>
+            <w:r>
+              <w:rPr>
+                <w:rFonts w:asciiTheme="minorHAnsi" w:eastAsiaTheme="minorEastAsia" w:hAnsiTheme="minorHAnsi" w:cstheme="minorBidi"/>
+                <w:color w:val="000000"/>
+                <w:sz w:val="22"/>
+                <w:szCs w:val="22"/>
+                <w:u w:val="single"/>
+              </w:rPr>
+              <w:t>El proyecto aplica ingeniería de requisitos, pruebas y validación, gestión de proyectos, modelamiento de la información (matriz y estados) y construcción e implantación de una solución de software. En mi rol utilizo sobre todo requisitos, documentación y validación.</w:t>
+            </w:r>
+          </w:p>
+        </w:tc>
+      </w:tr>
+      <w:tr>
+        <w:tc>
+          <w:tcPr>
+            <w:tcW w:w="2041" w:type="dxa"/>
+            <w:tcBorders>
+              <w:top w:val="single" w:sz="4" w:space="0" w:color="BFBFBF" w:themeColor="background1" w:themeShade="BF"/>
+              <w:left w:val="single" w:sz="4" w:space="0" w:color="BFBFBF" w:themeColor="background1" w:themeShade="BF"/>
+              <w:bottom w:val="single" w:sz="4" w:space="0" w:color="BFBFBF" w:themeColor="background1" w:themeShade="BF"/>
+              <w:right w:val="single" w:sz="4" w:space="0" w:color="BFBFBF" w:themeColor="background1" w:themeShade="BF"/>
+            </w:tcBorders>
+            <w:hideMark/>
+          </w:tcPr>
+          <w:p>
+            <w:pPr>
+              <w:rPr>
+                <w:rFonts w:asciiTheme="minorHAnsi" w:eastAsiaTheme="minorEastAsia" w:hAnsiTheme="minorHAnsi" w:cstheme="minorBidi"/>
+                <w:color w:val="000000"/>
+                <w:sz w:val="22"/>
+                <w:szCs w:val="22"/>
+                <w:u w:val="single"/>
+              </w:rPr>
+            </w:pPr>
+            <w:r>
+              <w:rPr>
+                <w:rFonts w:asciiTheme="minorHAnsi" w:eastAsiaTheme="minorEastAsia" w:hAnsiTheme="minorHAnsi" w:cstheme="minorBidi"/>
+                <w:color w:val="000000"/>
+                <w:sz w:val="22"/>
+                <w:szCs w:val="22"/>
+                <w:u w:val="single"/>
+              </w:rPr>
+              <w:t>3. Intereses profesionales</w:t>
+            </w:r>
+          </w:p>
+        </w:tc>
+        <w:tc>
+          <w:tcPr>
+            <w:tcW w:w="1701" w:type="dxa"/>
+            <w:tcBorders>
+              <w:top w:val="single" w:sz="4" w:space="0" w:color="BFBFBF" w:themeColor="background1" w:themeShade="BF"/>
+              <w:left w:val="single" w:sz="4" w:space="0" w:color="BFBFBF" w:themeColor="background1" w:themeShade="BF"/>
+              <w:bottom w:val="single" w:sz="4" w:space="0" w:color="BFBFBF" w:themeColor="background1" w:themeShade="BF"/>
+              <w:right w:val="single" w:sz="4" w:space="0" w:color="BFBFBF" w:themeColor="background1" w:themeShade="BF"/>
+            </w:tcBorders>
+            <w:hideMark/>
+          </w:tcPr>
+          <w:p>
+            <w:pPr>
+              <w:rPr>
+                <w:rFonts w:asciiTheme="minorHAnsi" w:eastAsiaTheme="minorEastAsia" w:hAnsiTheme="minorHAnsi" w:cstheme="minorBidi"/>
+                <w:color w:val="000000"/>
+                <w:sz w:val="22"/>
+                <w:szCs w:val="22"/>
+                <w:u w:val="single"/>
+              </w:rPr>
+            </w:pPr>
+            <w:r>
+              <w:rPr>
+                <w:rFonts w:asciiTheme="minorHAnsi" w:eastAsiaTheme="minorEastAsia" w:hAnsiTheme="minorHAnsi" w:cstheme="minorBidi"/>
+                <w:color w:val="000000"/>
+                <w:sz w:val="22"/>
+                <w:szCs w:val="22"/>
+                <w:u w:val="single"/>
+              </w:rPr>
+              <w:t>Completamente logrado</w:t>
+            </w:r>
+          </w:p>
+        </w:tc>
+        <w:tc>
+          <w:tcPr>
+            <w:tcW w:w="5896" w:type="dxa"/>
+            <w:tcBorders>
+              <w:top w:val="single" w:sz="4" w:space="0" w:color="BFBFBF" w:themeColor="background1" w:themeShade="BF"/>
+              <w:left w:val="single" w:sz="4" w:space="0" w:color="BFBFBF" w:themeColor="background1" w:themeShade="BF"/>
+              <w:bottom w:val="single" w:sz="4" w:space="0" w:color="BFBFBF" w:themeColor="background1" w:themeShade="BF"/>
+              <w:right w:val="single" w:sz="4" w:space="0" w:color="BFBFBF" w:themeColor="background1" w:themeShade="BF"/>
+            </w:tcBorders>
+            <w:hideMark/>
+          </w:tcPr>
+          <w:p>
+            <w:pPr>
+              <w:rPr>
+                <w:rFonts w:asciiTheme="minorHAnsi" w:eastAsiaTheme="minorEastAsia" w:hAnsiTheme="minorHAnsi" w:cstheme="minorBidi"/>
+                <w:color w:val="000000"/>
+                <w:sz w:val="22"/>
+                <w:szCs w:val="22"/>
+                <w:u w:val="single"/>
+              </w:rPr>
+            </w:pPr>
+            <w:r>
+              <w:rPr>
+                <w:rFonts w:asciiTheme="minorHAnsi" w:eastAsiaTheme="minorEastAsia" w:hAnsiTheme="minorHAnsi" w:cstheme="minorBidi"/>
+                <w:color w:val="000000"/>
+                <w:sz w:val="22"/>
+                <w:szCs w:val="22"/>
+                <w:u w:val="single"/>
+              </w:rPr>
+              <w:t>Me interesa el análisis funcional, el aseguramiento de calidad y la automatización de procesos de negocio en empresas que usan SAP, que es exactamente el contexto del proyecto.</w:t>
+            </w:r>
+          </w:p>
+        </w:tc>
+      </w:tr>
+      <w:tr>
+        <w:tc>
+          <w:tcPr>
+            <w:tcW w:w="2041" w:type="dxa"/>
+            <w:tcBorders>
+              <w:top w:val="single" w:sz="4" w:space="0" w:color="BFBFBF" w:themeColor="background1" w:themeShade="BF"/>
+              <w:left w:val="single" w:sz="4" w:space="0" w:color="BFBFBF" w:themeColor="background1" w:themeShade="BF"/>
+              <w:bottom w:val="single" w:sz="4" w:space="0" w:color="BFBFBF" w:themeColor="background1" w:themeShade="BF"/>
+              <w:right w:val="single" w:sz="4" w:space="0" w:color="BFBFBF" w:themeColor="background1" w:themeShade="BF"/>
+            </w:tcBorders>
+            <w:hideMark/>
+          </w:tcPr>
+          <w:p>
+            <w:pPr>
+              <w:rPr>
+                <w:rFonts w:asciiTheme="minorHAnsi" w:eastAsiaTheme="minorEastAsia" w:hAnsiTheme="minorHAnsi" w:cstheme="minorBidi"/>
+                <w:color w:val="000000"/>
+                <w:sz w:val="22"/>
+                <w:szCs w:val="22"/>
+                <w:u w:val="single"/>
+              </w:rPr>
+            </w:pPr>
+            <w:r>
+              <w:rPr>
+                <w:rFonts w:asciiTheme="minorHAnsi" w:eastAsiaTheme="minorEastAsia" w:hAnsiTheme="minorHAnsi" w:cstheme="minorBidi"/>
+                <w:color w:val="000000"/>
+                <w:sz w:val="22"/>
+                <w:szCs w:val="22"/>
+                <w:u w:val="single"/>
+              </w:rPr>
+              <w:t>4. Factibilidad</w:t>
+            </w:r>
+          </w:p>
+        </w:tc>
+        <w:tc>
+          <w:tcPr>
+            <w:tcW w:w="1701" w:type="dxa"/>
+            <w:tcBorders>
+              <w:top w:val="single" w:sz="4" w:space="0" w:color="BFBFBF" w:themeColor="background1" w:themeShade="BF"/>
+              <w:left w:val="single" w:sz="4" w:space="0" w:color="BFBFBF" w:themeColor="background1" w:themeShade="BF"/>
+              <w:bottom w:val="single" w:sz="4" w:space="0" w:color="BFBFBF" w:themeColor="background1" w:themeShade="BF"/>
+              <w:right w:val="single" w:sz="4" w:space="0" w:color="BFBFBF" w:themeColor="background1" w:themeShade="BF"/>
+            </w:tcBorders>
+            <w:hideMark/>
+          </w:tcPr>
+          <w:p>
+            <w:pPr>
+              <w:rPr>
+                <w:rFonts w:asciiTheme="minorHAnsi" w:eastAsiaTheme="minorEastAsia" w:hAnsiTheme="minorHAnsi" w:cstheme="minorBidi"/>
+                <w:color w:val="000000"/>
+                <w:sz w:val="22"/>
+                <w:szCs w:val="22"/>
+                <w:u w:val="single"/>
+              </w:rPr>
+            </w:pPr>
+            <w:r>
+              <w:rPr>
+                <w:rFonts w:asciiTheme="minorHAnsi" w:eastAsiaTheme="minorEastAsia" w:hAnsiTheme="minorHAnsi" w:cstheme="minorBidi"/>
+                <w:color w:val="000000"/>
+                <w:sz w:val="22"/>
+                <w:szCs w:val="22"/>
+                <w:u w:val="single"/>
+              </w:rPr>
+              <w:t>Completamente logrado</w:t>
+            </w:r>
+          </w:p>
+        </w:tc>
+        <w:tc>
+          <w:tcPr>
+            <w:tcW w:w="5896" w:type="dxa"/>
+            <w:tcBorders>
+              <w:top w:val="single" w:sz="4" w:space="0" w:color="BFBFBF" w:themeColor="background1" w:themeShade="BF"/>
+              <w:left w:val="single" w:sz="4" w:space="0" w:color="BFBFBF" w:themeColor="background1" w:themeShade="BF"/>
+              <w:bottom w:val="single" w:sz="4" w:space="0" w:color="BFBFBF" w:themeColor="background1" w:themeShade="BF"/>
+              <w:right w:val="single" w:sz="4" w:space="0" w:color="BFBFBF" w:themeColor="background1" w:themeShade="BF"/>
+            </w:tcBorders>
+            <w:hideMark/>
+          </w:tcPr>
+          <w:p>
+            <w:pPr>
+              <w:rPr>
+                <w:rFonts w:asciiTheme="minorHAnsi" w:eastAsiaTheme="minorEastAsia" w:hAnsiTheme="minorHAnsi" w:cstheme="minorBidi"/>
+                <w:color w:val="000000"/>
+                <w:sz w:val="22"/>
+                <w:szCs w:val="22"/>
+                <w:u w:val="single"/>
+              </w:rPr>
+            </w:pPr>
+            <w:r>
+              <w:rPr>
+                <w:rFonts w:asciiTheme="minorHAnsi" w:eastAsiaTheme="minorEastAsia" w:hAnsiTheme="minorHAnsi" w:cstheme="minorBidi"/>
+                <w:color w:val="000000"/>
+                <w:sz w:val="22"/>
+                <w:szCs w:val="22"/>
+                <w:u w:val="single"/>
+              </w:rPr>
+              <w:t xml:space="preserve">El proyecto es factible porque se desarrolla sobre herramientas que la empresa ya utiliza (SAP GUI, Excel, Outlook, SharePoint) y hoy se encuentra funcional y en operación controlada. Identificamos dificultades y cómo abordarlas: la dependencia de una sesión interactiva de Windows y de un equipo específico (se mantiene una instalación de respaldo y se evalúa </w:t>
+            </w:r>
+            <w:r>
+              <w:rPr>
+                <w:rFonts w:asciiTheme="minorHAnsi" w:eastAsiaTheme="minorEastAsia" w:hAnsiTheme="minorHAnsi" w:cstheme="minorBidi"/>
+                <w:color w:val="000000"/>
+                <w:sz w:val="22"/>
+                <w:szCs w:val="22"/>
+                <w:u w:val="single"/>
+              </w:rPr>
+              <w:lastRenderedPageBreak/>
+              <w:t>la migración a GREPORTS con ICT), y el acceso a datos corporativos (se usan datos ficticios o anonimizados y no se publican credenciales).</w:t>
+            </w:r>
+          </w:p>
+        </w:tc>
+      </w:tr>
+      <w:tr>
+        <w:tc>
+          <w:tcPr>
+            <w:tcW w:w="2041" w:type="dxa"/>
+            <w:tcBorders>
+              <w:top w:val="single" w:sz="4" w:space="0" w:color="BFBFBF" w:themeColor="background1" w:themeShade="BF"/>
+              <w:left w:val="single" w:sz="4" w:space="0" w:color="BFBFBF" w:themeColor="background1" w:themeShade="BF"/>
+              <w:bottom w:val="single" w:sz="4" w:space="0" w:color="BFBFBF" w:themeColor="background1" w:themeShade="BF"/>
+              <w:right w:val="single" w:sz="4" w:space="0" w:color="BFBFBF" w:themeColor="background1" w:themeShade="BF"/>
+            </w:tcBorders>
+            <w:hideMark/>
+          </w:tcPr>
+          <w:p>
+            <w:pPr>
+              <w:rPr>
+                <w:rFonts w:asciiTheme="minorHAnsi" w:eastAsiaTheme="minorEastAsia" w:hAnsiTheme="minorHAnsi" w:cstheme="minorBidi"/>
+                <w:color w:val="000000"/>
+                <w:sz w:val="22"/>
+                <w:szCs w:val="22"/>
+                <w:u w:val="single"/>
+              </w:rPr>
+            </w:pPr>
+            <w:r>
+              <w:rPr>
+                <w:rFonts w:asciiTheme="minorHAnsi" w:eastAsiaTheme="minorEastAsia" w:hAnsiTheme="minorHAnsi" w:cstheme="minorBidi"/>
+                <w:color w:val="000000"/>
+                <w:sz w:val="22"/>
+                <w:szCs w:val="22"/>
+                <w:u w:val="single"/>
+              </w:rPr>
+              <w:lastRenderedPageBreak/>
+              <w:t>5. Objetivos</w:t>
+            </w:r>
+          </w:p>
+        </w:tc>
+        <w:tc>
+          <w:tcPr>
+            <w:tcW w:w="1701" w:type="dxa"/>
+            <w:tcBorders>
+              <w:top w:val="single" w:sz="4" w:space="0" w:color="BFBFBF" w:themeColor="background1" w:themeShade="BF"/>
+              <w:left w:val="single" w:sz="4" w:space="0" w:color="BFBFBF" w:themeColor="background1" w:themeShade="BF"/>
+              <w:bottom w:val="single" w:sz="4" w:space="0" w:color="BFBFBF" w:themeColor="background1" w:themeShade="BF"/>
+              <w:right w:val="single" w:sz="4" w:space="0" w:color="BFBFBF" w:themeColor="background1" w:themeShade="BF"/>
+            </w:tcBorders>
+            <w:hideMark/>
+          </w:tcPr>
+          <w:p>
+            <w:pPr>
+              <w:rPr>
+                <w:rFonts w:asciiTheme="minorHAnsi" w:eastAsiaTheme="minorEastAsia" w:hAnsiTheme="minorHAnsi" w:cstheme="minorBidi"/>
+                <w:color w:val="000000"/>
+                <w:sz w:val="22"/>
+                <w:szCs w:val="22"/>
+                <w:u w:val="single"/>
+              </w:rPr>
+            </w:pPr>
+            <w:r>
+              <w:rPr>
+                <w:rFonts w:asciiTheme="minorHAnsi" w:eastAsiaTheme="minorEastAsia" w:hAnsiTheme="minorHAnsi" w:cstheme="minorBidi"/>
+                <w:color w:val="000000"/>
+                <w:sz w:val="22"/>
+                <w:szCs w:val="22"/>
+                <w:u w:val="single"/>
+              </w:rPr>
+              <w:t>Completamente logrado</w:t>
+            </w:r>
+          </w:p>
+        </w:tc>
+        <w:tc>
+          <w:tcPr>
+            <w:tcW w:w="5896" w:type="dxa"/>
+            <w:tcBorders>
+              <w:top w:val="single" w:sz="4" w:space="0" w:color="BFBFBF" w:themeColor="background1" w:themeShade="BF"/>
+              <w:left w:val="single" w:sz="4" w:space="0" w:color="BFBFBF" w:themeColor="background1" w:themeShade="BF"/>
+              <w:bottom w:val="single" w:sz="4" w:space="0" w:color="BFBFBF" w:themeColor="background1" w:themeShade="BF"/>
+              <w:right w:val="single" w:sz="4" w:space="0" w:color="BFBFBF" w:themeColor="background1" w:themeShade="BF"/>
+            </w:tcBorders>
+            <w:hideMark/>
+          </w:tcPr>
+          <w:p>
+            <w:pPr>
+              <w:rPr>
+                <w:rFonts w:asciiTheme="minorHAnsi" w:eastAsiaTheme="minorEastAsia" w:hAnsiTheme="minorHAnsi" w:cstheme="minorBidi"/>
+                <w:color w:val="000000"/>
+                <w:sz w:val="22"/>
+                <w:szCs w:val="22"/>
+                <w:u w:val="single"/>
+              </w:rPr>
+            </w:pPr>
+            <w:r>
+              <w:rPr>
+                <w:rFonts w:asciiTheme="minorHAnsi" w:eastAsiaTheme="minorEastAsia" w:hAnsiTheme="minorHAnsi" w:cstheme="minorBidi"/>
+                <w:color w:val="000000"/>
+                <w:sz w:val="22"/>
+                <w:szCs w:val="22"/>
+                <w:u w:val="single"/>
+              </w:rPr>
+              <w:t>Los objetivos son claros y medibles: automatizar la extracción, validación, consolidación, generación de reportes, publicación y notificación del proceso FBL1N.</w:t>
+            </w:r>
+          </w:p>
+        </w:tc>
+      </w:tr>
+      <w:tr>
+        <w:tc>
+          <w:tcPr>
+            <w:tcW w:w="2041" w:type="dxa"/>
+            <w:tcBorders>
+              <w:top w:val="single" w:sz="4" w:space="0" w:color="BFBFBF" w:themeColor="background1" w:themeShade="BF"/>
+              <w:left w:val="single" w:sz="4" w:space="0" w:color="BFBFBF" w:themeColor="background1" w:themeShade="BF"/>
+              <w:bottom w:val="single" w:sz="4" w:space="0" w:color="BFBFBF" w:themeColor="background1" w:themeShade="BF"/>
+              <w:right w:val="single" w:sz="4" w:space="0" w:color="BFBFBF" w:themeColor="background1" w:themeShade="BF"/>
+            </w:tcBorders>
+            <w:hideMark/>
+          </w:tcPr>
+          <w:p>
+            <w:pPr>
+              <w:rPr>
+                <w:rFonts w:asciiTheme="minorHAnsi" w:eastAsiaTheme="minorEastAsia" w:hAnsiTheme="minorHAnsi" w:cstheme="minorBidi"/>
+                <w:color w:val="000000"/>
+                <w:sz w:val="22"/>
+                <w:szCs w:val="22"/>
+                <w:u w:val="single"/>
+              </w:rPr>
+            </w:pPr>
+            <w:r>
+              <w:rPr>
+                <w:rFonts w:asciiTheme="minorHAnsi" w:eastAsiaTheme="minorEastAsia" w:hAnsiTheme="minorHAnsi" w:cstheme="minorBidi"/>
+                <w:color w:val="000000"/>
+                <w:sz w:val="22"/>
+                <w:szCs w:val="22"/>
+                <w:u w:val="single"/>
+              </w:rPr>
+              <w:t>6. Metodología</w:t>
+            </w:r>
+          </w:p>
+        </w:tc>
+        <w:tc>
+          <w:tcPr>
+            <w:tcW w:w="1701" w:type="dxa"/>
+            <w:tcBorders>
+              <w:top w:val="single" w:sz="4" w:space="0" w:color="BFBFBF" w:themeColor="background1" w:themeShade="BF"/>
+              <w:left w:val="single" w:sz="4" w:space="0" w:color="BFBFBF" w:themeColor="background1" w:themeShade="BF"/>
+              <w:bottom w:val="single" w:sz="4" w:space="0" w:color="BFBFBF" w:themeColor="background1" w:themeShade="BF"/>
+              <w:right w:val="single" w:sz="4" w:space="0" w:color="BFBFBF" w:themeColor="background1" w:themeShade="BF"/>
+            </w:tcBorders>
+            <w:hideMark/>
+          </w:tcPr>
+          <w:p>
+            <w:pPr>
+              <w:rPr>
+                <w:rFonts w:asciiTheme="minorHAnsi" w:eastAsiaTheme="minorEastAsia" w:hAnsiTheme="minorHAnsi" w:cstheme="minorBidi"/>
+                <w:color w:val="000000"/>
+                <w:sz w:val="22"/>
+                <w:szCs w:val="22"/>
+                <w:u w:val="single"/>
+              </w:rPr>
+            </w:pPr>
+            <w:r>
+              <w:rPr>
+                <w:rFonts w:asciiTheme="minorHAnsi" w:eastAsiaTheme="minorEastAsia" w:hAnsiTheme="minorHAnsi" w:cstheme="minorBidi"/>
+                <w:color w:val="000000"/>
+                <w:sz w:val="22"/>
+                <w:szCs w:val="22"/>
+                <w:u w:val="single"/>
+              </w:rPr>
+              <w:t>Completamente logrado</w:t>
+            </w:r>
+          </w:p>
+        </w:tc>
+        <w:tc>
+          <w:tcPr>
+            <w:tcW w:w="5896" w:type="dxa"/>
+            <w:tcBorders>
+              <w:top w:val="single" w:sz="4" w:space="0" w:color="BFBFBF" w:themeColor="background1" w:themeShade="BF"/>
+              <w:left w:val="single" w:sz="4" w:space="0" w:color="BFBFBF" w:themeColor="background1" w:themeShade="BF"/>
+              <w:bottom w:val="single" w:sz="4" w:space="0" w:color="BFBFBF" w:themeColor="background1" w:themeShade="BF"/>
+              <w:right w:val="single" w:sz="4" w:space="0" w:color="BFBFBF" w:themeColor="background1" w:themeShade="BF"/>
+            </w:tcBorders>
+            <w:hideMark/>
+          </w:tcPr>
+          <w:p>
+            <w:pPr>
+              <w:rPr>
+                <w:rFonts w:asciiTheme="minorHAnsi" w:eastAsiaTheme="minorEastAsia" w:hAnsiTheme="minorHAnsi" w:cstheme="minorBidi"/>
+                <w:color w:val="000000"/>
+                <w:sz w:val="22"/>
+                <w:szCs w:val="22"/>
+                <w:u w:val="single"/>
+              </w:rPr>
+            </w:pPr>
+            <w:r>
+              <w:rPr>
+                <w:rFonts w:asciiTheme="minorHAnsi" w:eastAsiaTheme="minorEastAsia" w:hAnsiTheme="minorHAnsi" w:cstheme="minorBidi"/>
+                <w:color w:val="000000"/>
+                <w:sz w:val="22"/>
+                <w:szCs w:val="22"/>
+                <w:u w:val="single"/>
+              </w:rPr>
+              <w:t>Usamos un enfoque híbrido Kanban y DevOps, con desarrollo iterativo e incremental, pruebas antes de integrar cambios, control de versiones con Git/GitHub, despliegues controlados con respaldos y logs para auditar cada ejecución.</w:t>
+            </w:r>
+          </w:p>
+        </w:tc>
+      </w:tr>
+      <w:tr>
+        <w:tc>
+          <w:tcPr>
+            <w:tcW w:w="2041" w:type="dxa"/>
+            <w:tcBorders>
+              <w:top w:val="single" w:sz="4" w:space="0" w:color="BFBFBF" w:themeColor="background1" w:themeShade="BF"/>
+              <w:left w:val="single" w:sz="4" w:space="0" w:color="BFBFBF" w:themeColor="background1" w:themeShade="BF"/>
+              <w:bottom w:val="single" w:sz="4" w:space="0" w:color="BFBFBF" w:themeColor="background1" w:themeShade="BF"/>
+              <w:right w:val="single" w:sz="4" w:space="0" w:color="BFBFBF" w:themeColor="background1" w:themeShade="BF"/>
+            </w:tcBorders>
+            <w:hideMark/>
+          </w:tcPr>
+          <w:p>
+            <w:pPr>
+              <w:rPr>
+                <w:rFonts w:asciiTheme="minorHAnsi" w:eastAsiaTheme="minorEastAsia" w:hAnsiTheme="minorHAnsi" w:cstheme="minorBidi"/>
+                <w:color w:val="000000"/>
+                <w:sz w:val="22"/>
+                <w:szCs w:val="22"/>
+                <w:u w:val="single"/>
+              </w:rPr>
+            </w:pPr>
+            <w:r>
+              <w:rPr>
+                <w:rFonts w:asciiTheme="minorHAnsi" w:eastAsiaTheme="minorEastAsia" w:hAnsiTheme="minorHAnsi" w:cstheme="minorBidi"/>
+                <w:color w:val="000000"/>
+                <w:sz w:val="22"/>
+                <w:szCs w:val="22"/>
+                <w:u w:val="single"/>
+              </w:rPr>
+              <w:t>7. Plan de trabajo</w:t>
+            </w:r>
+          </w:p>
+        </w:tc>
+        <w:tc>
+          <w:tcPr>
+            <w:tcW w:w="1701" w:type="dxa"/>
+            <w:tcBorders>
+              <w:top w:val="single" w:sz="4" w:space="0" w:color="BFBFBF" w:themeColor="background1" w:themeShade="BF"/>
+              <w:left w:val="single" w:sz="4" w:space="0" w:color="BFBFBF" w:themeColor="background1" w:themeShade="BF"/>
+              <w:bottom w:val="single" w:sz="4" w:space="0" w:color="BFBFBF" w:themeColor="background1" w:themeShade="BF"/>
+              <w:right w:val="single" w:sz="4" w:space="0" w:color="BFBFBF" w:themeColor="background1" w:themeShade="BF"/>
+            </w:tcBorders>
+            <w:hideMark/>
+          </w:tcPr>
+          <w:p>
+            <w:pPr>
+              <w:rPr>
+                <w:rFonts w:asciiTheme="minorHAnsi" w:eastAsiaTheme="minorEastAsia" w:hAnsiTheme="minorHAnsi" w:cstheme="minorBidi"/>
+                <w:color w:val="000000"/>
+                <w:sz w:val="22"/>
+                <w:szCs w:val="22"/>
+                <w:u w:val="single"/>
+              </w:rPr>
+            </w:pPr>
+            <w:r>
+              <w:rPr>
+                <w:rFonts w:asciiTheme="minorHAnsi" w:eastAsiaTheme="minorEastAsia" w:hAnsiTheme="minorHAnsi" w:cstheme="minorBidi"/>
+                <w:color w:val="000000"/>
+                <w:sz w:val="22"/>
+                <w:szCs w:val="22"/>
+                <w:u w:val="single"/>
+              </w:rPr>
+              <w:t>Completamente l</w:t>
+            </w:r>
+            <w:r>
+              <w:rPr>
+                <w:rFonts w:asciiTheme="minorHAnsi" w:eastAsiaTheme="minorEastAsia" w:hAnsiTheme="minorHAnsi" w:cstheme="minorBidi"/>
+                <w:color w:val="000000"/>
+                <w:sz w:val="22"/>
+                <w:szCs w:val="22"/>
+                <w:u w:val="single"/>
+              </w:rPr>
+              <w:t>ogrado</w:t>
+            </w:r>
+          </w:p>
+        </w:tc>
+        <w:tc>
+          <w:tcPr>
+            <w:tcW w:w="5896" w:type="dxa"/>
+            <w:tcBorders>
+              <w:top w:val="single" w:sz="4" w:space="0" w:color="BFBFBF" w:themeColor="background1" w:themeShade="BF"/>
+              <w:left w:val="single" w:sz="4" w:space="0" w:color="BFBFBF" w:themeColor="background1" w:themeShade="BF"/>
+              <w:bottom w:val="single" w:sz="4" w:space="0" w:color="BFBFBF" w:themeColor="background1" w:themeShade="BF"/>
+              <w:right w:val="single" w:sz="4" w:space="0" w:color="BFBFBF" w:themeColor="background1" w:themeShade="BF"/>
+            </w:tcBorders>
+            <w:hideMark/>
+          </w:tcPr>
+          <w:p>
+            <w:pPr>
+              <w:rPr>
+                <w:rFonts w:asciiTheme="minorHAnsi" w:eastAsiaTheme="minorEastAsia" w:hAnsiTheme="minorHAnsi" w:cstheme="minorBidi"/>
+                <w:color w:val="000000"/>
+                <w:sz w:val="22"/>
+                <w:szCs w:val="22"/>
+                <w:u w:val="single"/>
+              </w:rPr>
+            </w:pPr>
+            <w:r>
+              <w:rPr>
+                <w:rFonts w:asciiTheme="minorHAnsi" w:eastAsiaTheme="minorEastAsia" w:hAnsiTheme="minorHAnsi" w:cstheme="minorBidi"/>
+                <w:color w:val="000000"/>
+                <w:sz w:val="22"/>
+                <w:szCs w:val="22"/>
+                <w:u w:val="single"/>
+              </w:rPr>
+              <w:t>Existe un cronograma por semanas (inicio el 13 de julio de 2026, requisitos y arquitectura, desarrollo modular, despliegue controlado y programación diaria</w:t>
+            </w:r>
+            <w:r>
+              <w:rPr>
+                <w:rFonts w:asciiTheme="minorHAnsi" w:eastAsiaTheme="minorEastAsia" w:hAnsiTheme="minorHAnsi" w:cstheme="minorBidi"/>
+                <w:color w:val="000000"/>
+                <w:sz w:val="22"/>
+                <w:szCs w:val="22"/>
+                <w:u w:val="single"/>
+              </w:rPr>
+              <w:t>).</w:t>
+            </w:r>
+          </w:p>
+        </w:tc>
+      </w:tr>
+      <w:tr>
+        <w:tc>
+          <w:tcPr>
+            <w:tcW w:w="2041" w:type="dxa"/>
+            <w:tcBorders>
+              <w:top w:val="single" w:sz="4" w:space="0" w:color="BFBFBF" w:themeColor="background1" w:themeShade="BF"/>
+              <w:left w:val="single" w:sz="4" w:space="0" w:color="BFBFBF" w:themeColor="background1" w:themeShade="BF"/>
+              <w:bottom w:val="single" w:sz="4" w:space="0" w:color="BFBFBF" w:themeColor="background1" w:themeShade="BF"/>
+              <w:right w:val="single" w:sz="4" w:space="0" w:color="BFBFBF" w:themeColor="background1" w:themeShade="BF"/>
+            </w:tcBorders>
+            <w:hideMark/>
+          </w:tcPr>
+          <w:p>
+            <w:pPr>
+              <w:rPr>
+                <w:rFonts w:asciiTheme="minorHAnsi" w:eastAsiaTheme="minorEastAsia" w:hAnsiTheme="minorHAnsi" w:cstheme="minorBidi"/>
+                <w:color w:val="000000"/>
+                <w:sz w:val="22"/>
+                <w:szCs w:val="22"/>
+                <w:u w:val="single"/>
+              </w:rPr>
+            </w:pPr>
+            <w:r>
+              <w:rPr>
+                <w:rFonts w:asciiTheme="minorHAnsi" w:eastAsiaTheme="minorEastAsia" w:hAnsiTheme="minorHAnsi" w:cstheme="minorBidi"/>
+                <w:color w:val="000000"/>
+                <w:sz w:val="22"/>
+                <w:szCs w:val="22"/>
+                <w:u w:val="single"/>
+              </w:rPr>
+              <w:t>8. Evidencias</w:t>
+            </w:r>
+          </w:p>
+        </w:tc>
+        <w:tc>
+          <w:tcPr>
+            <w:tcW w:w="1701" w:type="dxa"/>
+            <w:tcBorders>
+              <w:top w:val="single" w:sz="4" w:space="0" w:color="BFBFBF" w:themeColor="background1" w:themeShade="BF"/>
+              <w:left w:val="single" w:sz="4" w:space="0" w:color="BFBFBF" w:themeColor="background1" w:themeShade="BF"/>
+              <w:bottom w:val="single" w:sz="4" w:space="0" w:color="BFBFBF" w:themeColor="background1" w:themeShade="BF"/>
+              <w:right w:val="single" w:sz="4" w:space="0" w:color="BFBFBF" w:themeColor="background1" w:themeShade="BF"/>
+            </w:tcBorders>
+            <w:hideMark/>
+          </w:tcPr>
+          <w:p>
+            <w:pPr>
+              <w:rPr>
+                <w:rFonts w:asciiTheme="minorHAnsi" w:eastAsiaTheme="minorEastAsia" w:hAnsiTheme="minorHAnsi" w:cstheme="minorBidi"/>
+                <w:color w:val="000000"/>
+                <w:sz w:val="22"/>
+                <w:szCs w:val="22"/>
+                <w:u w:val="single"/>
+              </w:rPr>
+            </w:pPr>
+            <w:r>
+              <w:rPr>
+                <w:rFonts w:asciiTheme="minorHAnsi" w:eastAsiaTheme="minorEastAsia" w:hAnsiTheme="minorHAnsi" w:cstheme="minorBidi"/>
+                <w:color w:val="000000"/>
+                <w:sz w:val="22"/>
+                <w:szCs w:val="22"/>
+                <w:u w:val="single"/>
+              </w:rPr>
+              <w:t>Logrado</w:t>
+            </w:r>
+          </w:p>
+        </w:tc>
+        <w:tc>
+          <w:tcPr>
+            <w:tcW w:w="5896" w:type="dxa"/>
+            <w:tcBorders>
+              <w:top w:val="single" w:sz="4" w:space="0" w:color="BFBFBF" w:themeColor="background1" w:themeShade="BF"/>
+              <w:left w:val="single" w:sz="4" w:space="0" w:color="BFBFBF" w:themeColor="background1" w:themeShade="BF"/>
+              <w:bottom w:val="single" w:sz="4" w:space="0" w:color="BFBFBF" w:themeColor="background1" w:themeShade="BF"/>
+              <w:right w:val="single" w:sz="4" w:space="0" w:color="BFBFBF" w:themeColor="background1" w:themeShade="BF"/>
+            </w:tcBorders>
+            <w:hideMark/>
+          </w:tcPr>
+          <w:p>
+            <w:pPr>
+              <w:rPr>
+                <w:rFonts w:asciiTheme="minorHAnsi" w:eastAsiaTheme="minorEastAsia" w:hAnsiTheme="minorHAnsi" w:cstheme="minorBidi"/>
+                <w:color w:val="000000"/>
+                <w:sz w:val="22"/>
+                <w:szCs w:val="22"/>
+                <w:u w:val="single"/>
+              </w:rPr>
+            </w:pPr>
+            <w:r>
+              <w:rPr>
+                <w:rFonts w:asciiTheme="minorHAnsi" w:eastAsiaTheme="minorEastAsia" w:hAnsiTheme="minorHAnsi" w:cstheme="minorBidi"/>
+                <w:color w:val="000000"/>
+                <w:sz w:val="22"/>
+                <w:szCs w:val="22"/>
+                <w:u w:val="single"/>
+              </w:rPr>
+              <w:t>Las evidencias son el repositorio versionado, las pruebas automatizadas (pytest), los logs y estados de ejecución, los reportes generados y los correos de notificación. Me falta justificar con más claridad cómo cada evidencia demuestra el logro de una actividad.</w:t>
+            </w:r>
+          </w:p>
+        </w:tc>
+      </w:tr>
+      <w:tr>
+        <w:tc>
+          <w:tcPr>
+            <w:tcW w:w="2041" w:type="dxa"/>
+            <w:tcBorders>
+              <w:top w:val="single" w:sz="4" w:space="0" w:color="BFBFBF" w:themeColor="background1" w:themeShade="BF"/>
+              <w:left w:val="single" w:sz="4" w:space="0" w:color="BFBFBF" w:themeColor="background1" w:themeShade="BF"/>
+              <w:bottom w:val="single" w:sz="4" w:space="0" w:color="BFBFBF" w:themeColor="background1" w:themeShade="BF"/>
+              <w:right w:val="single" w:sz="4" w:space="0" w:color="BFBFBF" w:themeColor="background1" w:themeShade="BF"/>
+            </w:tcBorders>
+            <w:hideMark/>
+          </w:tcPr>
+          <w:p>
+            <w:pPr>
+              <w:rPr>
+                <w:rFonts w:asciiTheme="minorHAnsi" w:eastAsiaTheme="minorEastAsia" w:hAnsiTheme="minorHAnsi" w:cstheme="minorBidi"/>
+                <w:color w:val="000000"/>
+                <w:sz w:val="22"/>
+                <w:szCs w:val="22"/>
+                <w:u w:val="single"/>
+              </w:rPr>
+            </w:pPr>
+            <w:r>
+              <w:rPr>
+                <w:rFonts w:asciiTheme="minorHAnsi" w:eastAsiaTheme="minorEastAsia" w:hAnsiTheme="minorHAnsi" w:cstheme="minorBidi"/>
+                <w:color w:val="000000"/>
+                <w:sz w:val="22"/>
+                <w:szCs w:val="22"/>
+                <w:u w:val="single"/>
+              </w:rPr>
+              <w:t>9. Redacción y referencias</w:t>
+            </w:r>
+          </w:p>
+        </w:tc>
+        <w:tc>
+          <w:tcPr>
+            <w:tcW w:w="1701" w:type="dxa"/>
+            <w:tcBorders>
+              <w:top w:val="single" w:sz="4" w:space="0" w:color="BFBFBF" w:themeColor="background1" w:themeShade="BF"/>
+              <w:left w:val="single" w:sz="4" w:space="0" w:color="BFBFBF" w:themeColor="background1" w:themeShade="BF"/>
+              <w:bottom w:val="single" w:sz="4" w:space="0" w:color="BFBFBF" w:themeColor="background1" w:themeShade="BF"/>
+              <w:right w:val="single" w:sz="4" w:space="0" w:color="BFBFBF" w:themeColor="background1" w:themeShade="BF"/>
+            </w:tcBorders>
+            <w:hideMark/>
+          </w:tcPr>
+          <w:p>
+            <w:pPr>
+              <w:rPr>
+                <w:rFonts w:asciiTheme="minorHAnsi" w:eastAsiaTheme="minorEastAsia" w:hAnsiTheme="minorHAnsi" w:cstheme="minorBidi"/>
+                <w:color w:val="000000"/>
+                <w:sz w:val="22"/>
+                <w:szCs w:val="22"/>
+                <w:u w:val="single"/>
+              </w:rPr>
+            </w:pPr>
+            <w:r>
+              <w:rPr>
+                <w:rFonts w:asciiTheme="minorHAnsi" w:eastAsiaTheme="minorEastAsia" w:hAnsiTheme="minorHAnsi" w:cstheme="minorBidi"/>
+                <w:color w:val="000000"/>
+                <w:sz w:val="22"/>
+                <w:szCs w:val="22"/>
+                <w:u w:val="single"/>
+              </w:rPr>
+              <w:t>Logrado</w:t>
+            </w:r>
+          </w:p>
+        </w:tc>
+        <w:tc>
+          <w:tcPr>
+            <w:tcW w:w="5896" w:type="dxa"/>
+            <w:tcBorders>
+              <w:top w:val="single" w:sz="4" w:space="0" w:color="BFBFBF" w:themeColor="background1" w:themeShade="BF"/>
+              <w:left w:val="single" w:sz="4" w:space="0" w:color="BFBFBF" w:themeColor="background1" w:themeShade="BF"/>
+              <w:bottom w:val="single" w:sz="4" w:space="0" w:color="BFBFBF" w:themeColor="background1" w:themeShade="BF"/>
+              <w:right w:val="single" w:sz="4" w:space="0" w:color="BFBFBF" w:themeColor="background1" w:themeShade="BF"/>
+            </w:tcBorders>
+            <w:hideMark/>
+          </w:tcPr>
+          <w:p>
+            <w:pPr>
+              <w:rPr>
+                <w:rFonts w:asciiTheme="minorHAnsi" w:eastAsiaTheme="minorEastAsia" w:hAnsiTheme="minorHAnsi" w:cstheme="minorBidi"/>
+                <w:color w:val="000000"/>
+                <w:sz w:val="22"/>
+                <w:szCs w:val="22"/>
+                <w:u w:val="single"/>
+              </w:rPr>
+            </w:pPr>
+            <w:r>
+              <w:rPr>
+                <w:rFonts w:asciiTheme="minorHAnsi" w:eastAsiaTheme="minorEastAsia" w:hAnsiTheme="minorHAnsi" w:cstheme="minorBidi"/>
+                <w:color w:val="000000"/>
+                <w:sz w:val="22"/>
+                <w:szCs w:val="22"/>
+                <w:u w:val="single"/>
+              </w:rPr>
+              <w:t>Revisé la ortografía y la redacción, pero debo completar y revisar las citas y referencias en formato APA.</w:t>
+            </w:r>
+          </w:p>
+        </w:tc>
+      </w:tr>
+      <w:tr>
+        <w:tc>
+          <w:tcPr>
+            <w:tcW w:w="2041" w:type="dxa"/>
+            <w:tcBorders>
+              <w:top w:val="single" w:sz="4" w:space="0" w:color="BFBFBF" w:themeColor="background1" w:themeShade="BF"/>
+              <w:left w:val="single" w:sz="4" w:space="0" w:color="BFBFBF" w:themeColor="background1" w:themeShade="BF"/>
+              <w:bottom w:val="single" w:sz="4" w:space="0" w:color="BFBFBF" w:themeColor="background1" w:themeShade="BF"/>
+              <w:right w:val="single" w:sz="4" w:space="0" w:color="BFBFBF" w:themeColor="background1" w:themeShade="BF"/>
+            </w:tcBorders>
+            <w:hideMark/>
+          </w:tcPr>
+          <w:p>
+            <w:pPr>
+              <w:rPr>
+                <w:rFonts w:asciiTheme="minorHAnsi" w:eastAsiaTheme="minorEastAsia" w:hAnsiTheme="minorHAnsi" w:cstheme="minorBidi"/>
+                <w:color w:val="000000"/>
+                <w:sz w:val="22"/>
+                <w:szCs w:val="22"/>
+                <w:u w:val="single"/>
+              </w:rPr>
+            </w:pPr>
+            <w:r>
+              <w:rPr>
+                <w:rFonts w:asciiTheme="minorHAnsi" w:eastAsiaTheme="minorEastAsia" w:hAnsiTheme="minorHAnsi" w:cstheme="minorBidi"/>
+                <w:color w:val="000000"/>
+                <w:sz w:val="22"/>
+                <w:szCs w:val="22"/>
+                <w:u w:val="single"/>
+              </w:rPr>
+              <w:t>10. Formato</w:t>
+            </w:r>
+          </w:p>
+        </w:tc>
+        <w:tc>
+          <w:tcPr>
+            <w:tcW w:w="1701" w:type="dxa"/>
+            <w:tcBorders>
+              <w:top w:val="single" w:sz="4" w:space="0" w:color="BFBFBF" w:themeColor="background1" w:themeShade="BF"/>
+              <w:left w:val="single" w:sz="4" w:space="0" w:color="BFBFBF" w:themeColor="background1" w:themeShade="BF"/>
+              <w:bottom w:val="single" w:sz="4" w:space="0" w:color="BFBFBF" w:themeColor="background1" w:themeShade="BF"/>
+              <w:right w:val="single" w:sz="4" w:space="0" w:color="BFBFBF" w:themeColor="background1" w:themeShade="BF"/>
+            </w:tcBorders>
+            <w:hideMark/>
+          </w:tcPr>
+          <w:p>
+            <w:pPr>
+              <w:rPr>
+                <w:rFonts w:asciiTheme="minorHAnsi" w:eastAsiaTheme="minorEastAsia" w:hAnsiTheme="minorHAnsi" w:cstheme="minorBidi"/>
+                <w:color w:val="000000"/>
+                <w:sz w:val="22"/>
+                <w:szCs w:val="22"/>
+                <w:u w:val="single"/>
+              </w:rPr>
+            </w:pPr>
+            <w:r>
+              <w:rPr>
+                <w:rFonts w:asciiTheme="minorHAnsi" w:eastAsiaTheme="minorEastAsia" w:hAnsiTheme="minorHAnsi" w:cstheme="minorBidi"/>
+                <w:color w:val="000000"/>
+                <w:sz w:val="22"/>
+                <w:szCs w:val="22"/>
+                <w:u w:val="single"/>
+              </w:rPr>
+              <w:t>Completamente logrado</w:t>
+            </w:r>
+          </w:p>
+        </w:tc>
+        <w:tc>
+          <w:tcPr>
+            <w:tcW w:w="5896" w:type="dxa"/>
+            <w:tcBorders>
+              <w:top w:val="single" w:sz="4" w:space="0" w:color="BFBFBF" w:themeColor="background1" w:themeShade="BF"/>
+              <w:left w:val="single" w:sz="4" w:space="0" w:color="BFBFBF" w:themeColor="background1" w:themeShade="BF"/>
+              <w:bottom w:val="single" w:sz="4" w:space="0" w:color="BFBFBF" w:themeColor="background1" w:themeShade="BF"/>
+              <w:right w:val="single" w:sz="4" w:space="0" w:color="BFBFBF" w:themeColor="background1" w:themeShade="BF"/>
+            </w:tcBorders>
+            <w:hideMark/>
+          </w:tcPr>
+          <w:p>
+            <w:pPr>
+              <w:rPr>
+                <w:rFonts w:asciiTheme="minorHAnsi" w:eastAsiaTheme="minorEastAsia" w:hAnsiTheme="minorHAnsi" w:cstheme="minorBidi"/>
+                <w:color w:val="000000"/>
+                <w:sz w:val="22"/>
+                <w:szCs w:val="22"/>
+                <w:u w:val="single"/>
+              </w:rPr>
+            </w:pPr>
+            <w:r>
+              <w:rPr>
+                <w:rFonts w:asciiTheme="minorHAnsi" w:eastAsiaTheme="minorEastAsia" w:hAnsiTheme="minorHAnsi" w:cstheme="minorBidi"/>
+                <w:color w:val="000000"/>
+                <w:sz w:val="22"/>
+                <w:szCs w:val="22"/>
+                <w:u w:val="single"/>
+              </w:rPr>
+              <w:t>Los documentos usan los formatos entregados por la Escuela.</w:t>
+            </w:r>
+          </w:p>
+        </w:tc>
+      </w:tr>
+      <w:tr>
+        <w:tc>
+          <w:tcPr>
+            <w:tcW w:w="2041" w:type="dxa"/>
+            <w:tcBorders>
+              <w:top w:val="single" w:sz="4" w:space="0" w:color="BFBFBF" w:themeColor="background1" w:themeShade="BF"/>
+              <w:left w:val="single" w:sz="4" w:space="0" w:color="BFBFBF" w:themeColor="background1" w:themeShade="BF"/>
+              <w:bottom w:val="single" w:sz="4" w:space="0" w:color="BFBFBF" w:themeColor="background1" w:themeShade="BF"/>
+              <w:right w:val="single" w:sz="4" w:space="0" w:color="BFBFBF" w:themeColor="background1" w:themeShade="BF"/>
+            </w:tcBorders>
+            <w:hideMark/>
+          </w:tcPr>
+          <w:p>
+            <w:pPr>
+              <w:rPr>
+                <w:rFonts w:asciiTheme="minorHAnsi" w:eastAsiaTheme="minorEastAsia" w:hAnsiTheme="minorHAnsi" w:cstheme="minorBidi"/>
+                <w:color w:val="000000"/>
+                <w:sz w:val="22"/>
+                <w:szCs w:val="22"/>
+                <w:u w:val="single"/>
+              </w:rPr>
+            </w:pPr>
+            <w:r>
+              <w:rPr>
+                <w:rFonts w:asciiTheme="minorHAnsi" w:eastAsiaTheme="minorEastAsia" w:hAnsiTheme="minorHAnsi" w:cstheme="minorBidi"/>
+                <w:color w:val="000000"/>
+                <w:sz w:val="22"/>
+                <w:szCs w:val="22"/>
+                <w:u w:val="single"/>
+              </w:rPr>
+              <w:t>11. Indicadores de calidad</w:t>
+            </w:r>
+          </w:p>
+        </w:tc>
+        <w:tc>
+          <w:tcPr>
+            <w:tcW w:w="1701" w:type="dxa"/>
+            <w:tcBorders>
+              <w:top w:val="single" w:sz="4" w:space="0" w:color="BFBFBF" w:themeColor="background1" w:themeShade="BF"/>
+              <w:left w:val="single" w:sz="4" w:space="0" w:color="BFBFBF" w:themeColor="background1" w:themeShade="BF"/>
+              <w:bottom w:val="single" w:sz="4" w:space="0" w:color="BFBFBF" w:themeColor="background1" w:themeShade="BF"/>
+              <w:right w:val="single" w:sz="4" w:space="0" w:color="BFBFBF" w:themeColor="background1" w:themeShade="BF"/>
+            </w:tcBorders>
+            <w:hideMark/>
+          </w:tcPr>
+          <w:p>
+            <w:pPr>
+              <w:rPr>
+                <w:rFonts w:asciiTheme="minorHAnsi" w:eastAsiaTheme="minorEastAsia" w:hAnsiTheme="minorHAnsi" w:cstheme="minorBidi"/>
+                <w:color w:val="000000"/>
+                <w:sz w:val="22"/>
+                <w:szCs w:val="22"/>
+                <w:u w:val="single"/>
+              </w:rPr>
+            </w:pPr>
+            <w:r>
+              <w:rPr>
+                <w:rFonts w:asciiTheme="minorHAnsi" w:eastAsiaTheme="minorEastAsia" w:hAnsiTheme="minorHAnsi" w:cstheme="minorBidi"/>
+                <w:color w:val="000000"/>
+                <w:sz w:val="22"/>
+                <w:szCs w:val="22"/>
+                <w:u w:val="single"/>
+              </w:rPr>
+              <w:t>Completamente logrado</w:t>
+            </w:r>
+          </w:p>
+        </w:tc>
+        <w:tc>
+          <w:tcPr>
+            <w:tcW w:w="5896" w:type="dxa"/>
+            <w:tcBorders>
+              <w:top w:val="single" w:sz="4" w:space="0" w:color="BFBFBF" w:themeColor="background1" w:themeShade="BF"/>
+              <w:left w:val="single" w:sz="4" w:space="0" w:color="BFBFBF" w:themeColor="background1" w:themeShade="BF"/>
+              <w:bottom w:val="single" w:sz="4" w:space="0" w:color="BFBFBF" w:themeColor="background1" w:themeShade="BF"/>
+              <w:right w:val="single" w:sz="4" w:space="0" w:color="BFBFBF" w:themeColor="background1" w:themeShade="BF"/>
+            </w:tcBorders>
+            <w:hideMark/>
+          </w:tcPr>
+          <w:p>
+            <w:pPr>
+              <w:rPr>
+                <w:rFonts w:asciiTheme="minorHAnsi" w:eastAsiaTheme="minorEastAsia" w:hAnsiTheme="minorHAnsi" w:cstheme="minorBidi"/>
+                <w:color w:val="000000"/>
+                <w:sz w:val="22"/>
+                <w:szCs w:val="22"/>
+                <w:u w:val="single"/>
+              </w:rPr>
+            </w:pPr>
+            <w:r>
+              <w:rPr>
+                <w:rFonts w:asciiTheme="minorHAnsi" w:eastAsiaTheme="minorEastAsia" w:hAnsiTheme="minorHAnsi" w:cstheme="minorBidi"/>
+                <w:color w:val="000000"/>
+                <w:sz w:val="22"/>
+                <w:szCs w:val="22"/>
+                <w:u w:val="single"/>
+              </w:rPr>
+              <w:t>El proyecto cumple con los indicadores seleccionados: diseña y aplica pruebas (validaciones y pytest) y genera mejoras; planifica y controla el proyecto; diseña e implementa la estructura de datos (MATRIZ_FBL1N y estados JSON); construye, integra e implanta la solución en operación controlada.</w:t>
+            </w:r>
+          </w:p>
+        </w:tc>
+      </w:tr>
+      <w:tr>
+        <w:tc>
+          <w:tcPr>
+            <w:tcW w:w="2041" w:type="dxa"/>
+            <w:tcBorders>
+              <w:top w:val="single" w:sz="4" w:space="0" w:color="BFBFBF" w:themeColor="background1" w:themeShade="BF"/>
+              <w:left w:val="single" w:sz="4" w:space="0" w:color="BFBFBF" w:themeColor="background1" w:themeShade="BF"/>
+              <w:bottom w:val="single" w:sz="4" w:space="0" w:color="BFBFBF" w:themeColor="background1" w:themeShade="BF"/>
+              <w:right w:val="single" w:sz="4" w:space="0" w:color="BFBFBF" w:themeColor="background1" w:themeShade="BF"/>
+            </w:tcBorders>
+            <w:hideMark/>
+          </w:tcPr>
+          <w:p>
+            <w:pPr>
+              <w:rPr>
+                <w:rFonts w:asciiTheme="minorHAnsi" w:eastAsiaTheme="minorEastAsia" w:hAnsiTheme="minorHAnsi" w:cstheme="minorBidi"/>
+                <w:color w:val="000000"/>
+                <w:sz w:val="22"/>
+                <w:szCs w:val="22"/>
+                <w:u w:val="single"/>
+              </w:rPr>
+            </w:pPr>
+            <w:r>
+              <w:rPr>
+                <w:rFonts w:asciiTheme="minorHAnsi" w:eastAsiaTheme="minorEastAsia" w:hAnsiTheme="minorHAnsi" w:cstheme="minorBidi"/>
+                <w:color w:val="000000"/>
+                <w:sz w:val="22"/>
+                <w:szCs w:val="22"/>
+                <w:u w:val="single"/>
+              </w:rPr>
+              <w:t>12. Textos en inglés</w:t>
+            </w:r>
+          </w:p>
+        </w:tc>
+        <w:tc>
+          <w:tcPr>
+            <w:tcW w:w="1701" w:type="dxa"/>
+            <w:tcBorders>
+              <w:top w:val="single" w:sz="4" w:space="0" w:color="BFBFBF" w:themeColor="background1" w:themeShade="BF"/>
+              <w:left w:val="single" w:sz="4" w:space="0" w:color="BFBFBF" w:themeColor="background1" w:themeShade="BF"/>
+              <w:bottom w:val="single" w:sz="4" w:space="0" w:color="BFBFBF" w:themeColor="background1" w:themeShade="BF"/>
+              <w:right w:val="single" w:sz="4" w:space="0" w:color="BFBFBF" w:themeColor="background1" w:themeShade="BF"/>
+            </w:tcBorders>
+            <w:hideMark/>
+          </w:tcPr>
+          <w:p>
+            <w:pPr>
+              <w:rPr>
+                <w:rFonts w:asciiTheme="minorHAnsi" w:eastAsiaTheme="minorEastAsia" w:hAnsiTheme="minorHAnsi" w:cstheme="minorBidi"/>
+                <w:color w:val="000000"/>
+                <w:sz w:val="22"/>
+                <w:szCs w:val="22"/>
+                <w:u w:val="single"/>
+              </w:rPr>
+            </w:pPr>
+            <w:r>
+              <w:rPr>
+                <w:rFonts w:asciiTheme="minorHAnsi" w:eastAsiaTheme="minorEastAsia" w:hAnsiTheme="minorHAnsi" w:cstheme="minorBidi"/>
+                <w:color w:val="000000"/>
+                <w:sz w:val="22"/>
+                <w:szCs w:val="22"/>
+                <w:u w:val="single"/>
+              </w:rPr>
+              <w:t>Logrado</w:t>
+            </w:r>
+          </w:p>
+        </w:tc>
+        <w:tc>
+          <w:tcPr>
+            <w:tcW w:w="5896" w:type="dxa"/>
+            <w:tcBorders>
+              <w:top w:val="single" w:sz="4" w:space="0" w:color="BFBFBF" w:themeColor="background1" w:themeShade="BF"/>
+              <w:left w:val="single" w:sz="4" w:space="0" w:color="BFBFBF" w:themeColor="background1" w:themeShade="BF"/>
+              <w:bottom w:val="single" w:sz="4" w:space="0" w:color="BFBFBF" w:themeColor="background1" w:themeShade="BF"/>
+              <w:right w:val="single" w:sz="4" w:space="0" w:color="BFBFBF" w:themeColor="background1" w:themeShade="BF"/>
+            </w:tcBorders>
+            <w:hideMark/>
+          </w:tcPr>
+          <w:p>
+            <w:pPr>
+              <w:rPr>
+                <w:rFonts w:asciiTheme="minorHAnsi" w:eastAsiaTheme="minorEastAsia" w:hAnsiTheme="minorHAnsi" w:cstheme="minorBidi"/>
+                <w:color w:val="000000"/>
+                <w:sz w:val="22"/>
+                <w:szCs w:val="22"/>
+                <w:u w:val="single"/>
+              </w:rPr>
+            </w:pPr>
+            <w:r>
+              <w:rPr>
+                <w:rFonts w:asciiTheme="minorHAnsi" w:eastAsiaTheme="minorEastAsia" w:hAnsiTheme="minorHAnsi" w:cstheme="minorBidi"/>
+                <w:color w:val="000000"/>
+                <w:sz w:val="22"/>
+                <w:szCs w:val="22"/>
+                <w:u w:val="single"/>
+              </w:rPr>
+              <w:t>Puedo redactar el abstract, las conclusiones y la reflexión en inglés con una secuencia lógica, pero todavía debo revisar algunas estructuras gramaticales y vocabulario técnico.</w:t>
+            </w:r>
+          </w:p>
+        </w:tc>
+      </w:tr>
+    </w:tbl>
+    <w:p>
+      <w:pPr>
+        <w:rPr>
+          <w:rFonts w:asciiTheme="minorHAnsi" w:eastAsiaTheme="minorEastAsia" w:hAnsiTheme="minorHAnsi" w:cstheme="minorBidi"/>
+          <w:color w:val="000000"/>
+          <w:sz w:val="22"/>
+          <w:szCs w:val="22"/>
+          <w:u w:val="single"/>
+        </w:rPr>
+      </w:pPr>
+    </w:p>
     <w:p>
       <w:pPr>
         <w:rPr>
@@ -8888,7 +10059,7 @@
 </file>
 
 <file path=word/endnotes.xml><?xml version="1.0" encoding="utf-8"?>
-<w:endnotes xmlns:wpc="http://schemas.microsoft.com/office/word/2010/wordprocessingCanvas" xmlns:cx="http://schemas.microsoft.com/office/drawing/2014/chartex" xmlns:cx1="http://schemas.microsoft.com/office/drawing/2015/9/8/chartex" xmlns:cx2="http://schemas.microsoft.com/office/drawing/2015/10/21/chartex" xmlns:cx3="http://schemas.microsoft.com/office/drawing/2016/5/9/chartex" xmlns:cx4="http://schemas.microsoft.com/office/drawing/2016/5/10/chartex" xmlns:cx5="http://schemas.microsoft.com/office/drawing/2016/5/11/chartex" xmlns:cx6="http://schemas.microsoft.com/office/drawing/2016/5/12/chartex" xmlns:cx7="http://schemas.microsoft.com/office/drawing/2016/5/13/chartex" xmlns:cx8="http://schemas.microsoft.com/office/drawing/2016/5/14/chartex" xmlns:mc="http://schemas.openxmlformats.org/markup-compatibility/2006" xmlns:aink="http://schemas.microsoft.com/office/drawing/2016/ink" xmlns:am3d="http://schemas.microsoft.com/office/drawing/2017/model3d" xmlns:o="urn:schemas-microsoft-com:office:office" xmlns:oel="http://schemas.microsoft.com/office/2019/extlst" xmlns:r="http://schemas.openxmlformats.org/officeDocument/2006/relationships" xmlns:m="http://schemas.openxmlformats.org/officeDocument/2006/math" xmlns:v="urn:schemas-microsoft-com:vml" xmlns:wp14="http://schemas.microsoft.com/office/word/2010/wordprocessingDrawing" xmlns:wp="http://schemas.openxmlformats.org/drawingml/2006/wordprocessingDrawing" xmlns:w10="urn:schemas-microsoft-com:office:word" xmlns:w="http://schemas.openxmlformats.org/wordprocessingml/2006/main" xmlns:w14="http://schemas.microsoft.com/office/word/2010/wordml" xmlns:w15="http://schemas.microsoft.com/office/word/2012/wordml" xmlns:w16cex="http://schemas.microsoft.com/office/word/2018/wordml/cex" xmlns:w16cid="http://schemas.microsoft.com/office/word/2016/wordml/cid" xmlns:w16="http://schemas.microsoft.com/office/word/2018/wordml" xmlns:w16sdtdh="http://schemas.microsoft.com/office/word/2020/wordml/sdtdatahash" xmlns:w16se="http://schemas.microsoft.com/office/word/2015/wordml/symex" xmlns:wpg="http://schemas.microsoft.com/office/word/2010/wordprocessingGroup" xmlns:wpi="http://schemas.microsoft.com/office/word/2010/wordprocessingInk" xmlns:wne="http://schemas.microsoft.com/office/word/2006/wordml" xmlns:wps="http://schemas.microsoft.com/office/word/2010/wordprocessingShape" mc:Ignorable="w14 w15 w16se w16cid w16 w16cex w16sdtdh wp14">
+<w:endnotes xmlns:wpc="http://schemas.microsoft.com/office/word/2010/wordprocessingCanvas" xmlns:cx="http://schemas.microsoft.com/office/drawing/2014/chartex" xmlns:cx1="http://schemas.microsoft.com/office/drawing/2015/9/8/chartex" xmlns:cx2="http://schemas.microsoft.com/office/drawing/2015/10/21/chartex" xmlns:cx3="http://schemas.microsoft.com/office/drawing/2016/5/9/chartex" xmlns:cx4="http://schemas.microsoft.com/office/drawing/2016/5/10/chartex" xmlns:cx5="http://schemas.microsoft.com/office/drawing/2016/5/11/chartex" xmlns:cx6="http://schemas.microsoft.com/office/drawing/2016/5/12/chartex" xmlns:cx7="http://schemas.microsoft.com/office/drawing/2016/5/13/chartex" xmlns:cx8="http://schemas.microsoft.com/office/drawing/2016/5/14/chartex" xmlns:mc="http://schemas.openxmlformats.org/markup-compatibility/2006" xmlns:aink="http://schemas.microsoft.com/office/drawing/2016/ink" xmlns:am3d="http://schemas.microsoft.com/office/drawing/2017/model3d" xmlns:o="urn:schemas-microsoft-com:office:office" xmlns:oel="http://schemas.microsoft.com/office/2019/extlst" xmlns:r="http://schemas.openxmlformats.org/officeDocument/2006/relationships" xmlns:m="http://schemas.openxmlformats.org/officeDocument/2006/math" xmlns:v="urn:schemas-microsoft-com:vml" xmlns:wp14="http://schemas.microsoft.com/office/word/2010/wordprocessingDrawing" xmlns:wp="http://schemas.openxmlformats.org/drawingml/2006/wordprocessingDrawing" xmlns:w10="urn:schemas-microsoft-com:office:word" xmlns:w="http://schemas.openxmlformats.org/wordprocessingml/2006/main" xmlns:w14="http://schemas.microsoft.com/office/word/2010/wordml" xmlns:w15="http://schemas.microsoft.com/office/word/2012/wordml" xmlns:w16cex="http://schemas.microsoft.com/office/word/2018/wordml/cex" xmlns:w16cid="http://schemas.microsoft.com/office/word/2016/wordml/cid" xmlns:w16="http://schemas.microsoft.com/office/word/2018/wordml" xmlns:w16du="http://schemas.microsoft.com/office/word/2023/wordml/word16du" xmlns:w16sdtdh="http://schemas.microsoft.com/office/word/2020/wordml/sdtdatahash" xmlns:w16sdtfl="http://schemas.microsoft.com/office/word/2024/wordml/sdtformatlock" xmlns:w16se="http://schemas.microsoft.com/office/word/2015/wordml/symex" xmlns:wpg="http://schemas.microsoft.com/office/word/2010/wordprocessingGroup" xmlns:wpi="http://schemas.microsoft.com/office/word/2010/wordprocessingInk" xmlns:wne="http://schemas.microsoft.com/office/word/2006/wordml" xmlns:wps="http://schemas.microsoft.com/office/word/2010/wordprocessingShape" mc:Ignorable="w14 w15 w16se w16cid w16 w16cex w16sdtdh w16sdtfl w16du wp14">
   <w:endnote w:type="separator" w:id="-1">
     <w:p>
       <w:r>
@@ -8907,7 +10078,7 @@
 </file>
 
 <file path=word/footer1.xml><?xml version="1.0" encoding="utf-8"?>
-<w:ftr xmlns:wpc="http://schemas.microsoft.com/office/word/2010/wordprocessingCanvas" xmlns:cx="http://schemas.microsoft.com/office/drawing/2014/chartex" xmlns:cx1="http://schemas.microsoft.com/office/drawing/2015/9/8/chartex" xmlns:cx2="http://schemas.microsoft.com/office/drawing/2015/10/21/chartex" xmlns:cx3="http://schemas.microsoft.com/office/drawing/2016/5/9/chartex" xmlns:cx4="http://schemas.microsoft.com/office/drawing/2016/5/10/chartex" xmlns:cx5="http://schemas.microsoft.com/office/drawing/2016/5/11/chartex" xmlns:cx6="http://schemas.microsoft.com/office/drawing/2016/5/12/chartex" xmlns:cx7="http://schemas.microsoft.com/office/drawing/2016/5/13/chartex" xmlns:cx8="http://schemas.microsoft.com/office/drawing/2016/5/14/chartex" xmlns:mc="http://schemas.openxmlformats.org/markup-compatibility/2006" xmlns:aink="http://schemas.microsoft.com/office/drawing/2016/ink" xmlns:am3d="http://schemas.microsoft.com/office/drawing/2017/model3d" xmlns:o="urn:schemas-microsoft-com:office:office" xmlns:oel="http://schemas.microsoft.com/office/2019/extlst" xmlns:r="http://schemas.openxmlformats.org/officeDocument/2006/relationships" xmlns:m="http://schemas.openxmlformats.org/officeDocument/2006/math" xmlns:v="urn:schemas-microsoft-com:vml" xmlns:wp14="http://schemas.microsoft.com/office/word/2010/wordprocessingDrawing" xmlns:wp="http://schemas.openxmlformats.org/drawingml/2006/wordprocessingDrawing" xmlns:w10="urn:schemas-microsoft-com:office:word" xmlns:w="http://schemas.openxmlformats.org/wordprocessingml/2006/main" xmlns:w14="http://schemas.microsoft.com/office/word/2010/wordml" xmlns:w15="http://schemas.microsoft.com/office/word/2012/wordml" xmlns:w16cex="http://schemas.microsoft.com/office/word/2018/wordml/cex" xmlns:w16cid="http://schemas.microsoft.com/office/word/2016/wordml/cid" xmlns:w16="http://schemas.microsoft.com/office/word/2018/wordml" xmlns:w16sdtdh="http://schemas.microsoft.com/office/word/2020/wordml/sdtdatahash" xmlns:w16se="http://schemas.microsoft.com/office/word/2015/wordml/symex" xmlns:wpg="http://schemas.microsoft.com/office/word/2010/wordprocessingGroup" xmlns:wpi="http://schemas.microsoft.com/office/word/2010/wordprocessingInk" xmlns:wne="http://schemas.microsoft.com/office/word/2006/wordml" xmlns:wps="http://schemas.microsoft.com/office/word/2010/wordprocessingShape" mc:Ignorable="w14 w15 w16se w16cid w16 w16cex w16sdtdh wp14">
+<w:ftr xmlns:wpc="http://schemas.microsoft.com/office/word/2010/wordprocessingCanvas" xmlns:cx="http://schemas.microsoft.com/office/drawing/2014/chartex" xmlns:cx1="http://schemas.microsoft.com/office/drawing/2015/9/8/chartex" xmlns:cx2="http://schemas.microsoft.com/office/drawing/2015/10/21/chartex" xmlns:cx3="http://schemas.microsoft.com/office/drawing/2016/5/9/chartex" xmlns:cx4="http://schemas.microsoft.com/office/drawing/2016/5/10/chartex" xmlns:cx5="http://schemas.microsoft.com/office/drawing/2016/5/11/chartex" xmlns:cx6="http://schemas.microsoft.com/office/drawing/2016/5/12/chartex" xmlns:cx7="http://schemas.microsoft.com/office/drawing/2016/5/13/chartex" xmlns:cx8="http://schemas.microsoft.com/office/drawing/2016/5/14/chartex" xmlns:mc="http://schemas.openxmlformats.org/markup-compatibility/2006" xmlns:aink="http://schemas.microsoft.com/office/drawing/2016/ink" xmlns:am3d="http://schemas.microsoft.com/office/drawing/2017/model3d" xmlns:o="urn:schemas-microsoft-com:office:office" xmlns:oel="http://schemas.microsoft.com/office/2019/extlst" xmlns:r="http://schemas.openxmlformats.org/officeDocument/2006/relationships" xmlns:m="http://schemas.openxmlformats.org/officeDocument/2006/math" xmlns:v="urn:schemas-microsoft-com:vml" xmlns:wp14="http://schemas.microsoft.com/office/word/2010/wordprocessingDrawing" xmlns:wp="http://schemas.openxmlformats.org/drawingml/2006/wordprocessingDrawing" xmlns:w10="urn:schemas-microsoft-com:office:word" xmlns:w="http://schemas.openxmlformats.org/wordprocessingml/2006/main" xmlns:w14="http://schemas.microsoft.com/office/word/2010/wordml" xmlns:w15="http://schemas.microsoft.com/office/word/2012/wordml" xmlns:w16cex="http://schemas.microsoft.com/office/word/2018/wordml/cex" xmlns:w16cid="http://schemas.microsoft.com/office/word/2016/wordml/cid" xmlns:w16="http://schemas.microsoft.com/office/word/2018/wordml" xmlns:w16du="http://schemas.microsoft.com/office/word/2023/wordml/word16du" xmlns:w16sdtdh="http://schemas.microsoft.com/office/word/2020/wordml/sdtdatahash" xmlns:w16sdtfl="http://schemas.microsoft.com/office/word/2024/wordml/sdtformatlock" xmlns:w16se="http://schemas.microsoft.com/office/word/2015/wordml/symex" xmlns:wpg="http://schemas.microsoft.com/office/word/2010/wordprocessingGroup" xmlns:wpi="http://schemas.microsoft.com/office/word/2010/wordprocessingInk" xmlns:wne="http://schemas.microsoft.com/office/word/2006/wordml" xmlns:wps="http://schemas.microsoft.com/office/word/2010/wordprocessingShape" mc:Ignorable="w14 w15 w16se w16cid w16 w16cex w16sdtdh w16sdtfl w16du wp14">
   <w:p>
     <w:pPr>
       <w:pStyle w:val="Piedepgina"/>
@@ -9102,15 +10273,15 @@
             </wp:anchor>
           </w:drawing>
         </mc:Choice>
-        <mc:Fallback xmlns:a="http://schemas.openxmlformats.org/drawingml/2006/main">
+        <mc:Fallback>
           <w:pict>
-            <v:group id="Grupo 37" style="position:absolute;left:0;text-align:left;margin-left:416.8pt;margin-top:0;width:468pt;height:25.2pt;z-index:251662336;mso-width-percent:1000;mso-top-percent:200;mso-wrap-distance-left:0;mso-wrap-distance-right:0;mso-position-horizontal:right;mso-position-horizontal-relative:margin;mso-position-vertical-relative:bottom-margin-area;mso-width-percent:1000;mso-top-percent:200;mso-width-relative:margin;mso-height-relative:margin" coordsize="59626,3238" o:spid="_x0000_s1026" w14:anchorId="0F25DB77" o:gfxdata="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">
-              <v:rect id="Rectángulo 38" style="position:absolute;left:190;width:59436;height:188;visibility:visible;mso-wrap-style:square;v-text-anchor:middle" o:spid="_x0000_s1027" fillcolor="black [3213]" stroked="f" strokeweight="1pt" o:gfxdata="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"/>
+            <v:group w14:anchorId="0F25DB77" id="Grupo 37" o:spid="_x0000_s1026" style="position:absolute;left:0;text-align:left;margin-left:416.8pt;margin-top:0;width:468pt;height:25.2pt;z-index:251662336;mso-width-percent:1000;mso-top-percent:200;mso-wrap-distance-left:0;mso-wrap-distance-right:0;mso-position-horizontal:right;mso-position-horizontal-relative:margin;mso-position-vertical-relative:bottom-margin-area;mso-width-percent:1000;mso-top-percent:200;mso-width-relative:margin;mso-height-relative:margin" coordsize="59626,3238" o:gfxdata="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">
+              <v:rect id="Rectángulo 38" o:spid="_x0000_s1027" style="position:absolute;left:190;width:59436;height:188;visibility:visible;mso-wrap-style:square;v-text-anchor:middle" o:gfxdata="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" fillcolor="black [3213]" stroked="f" strokeweight="1pt"/>
               <v:shapetype id="_x0000_t202" coordsize="21600,21600" o:spt="202" path="m,l,21600r21600,l21600,xe">
                 <v:stroke joinstyle="miter"/>
                 <v:path gradientshapeok="t" o:connecttype="rect"/>
               </v:shapetype>
-              <v:shape id="Cuadro de texto 39" style="position:absolute;top:666;width:59436;height:2572;visibility:visible;mso-wrap-style:square;v-text-anchor:bottom" o:spid="_x0000_s1028" filled="f" stroked="f" strokeweight=".5pt" type="#_x0000_t202" o:gfxdata="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">
+              <v:shape id="Cuadro de texto 39" o:spid="_x0000_s1028" type="#_x0000_t202" style="position:absolute;top:666;width:59436;height:2572;visibility:visible;mso-wrap-style:square;v-text-anchor:bottom" o:gfxdata="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" filled="f" stroked="f" strokeweight=".5pt">
                 <v:textbox inset=",,,0">
                   <w:txbxContent>
                     <w:sdt>
@@ -9131,7 +10302,6 @@
                           <w:calendar w:val="gregorian"/>
                         </w:date>
                       </w:sdtPr>
-                      <w:sdtEndPr/>
                       <w:sdtContent>
                         <w:p>
                           <w:pPr>
@@ -9314,9 +10484,9 @@
             </wp:anchor>
           </w:drawing>
         </mc:Choice>
-        <mc:Fallback xmlns:a="http://schemas.openxmlformats.org/drawingml/2006/main">
+        <mc:Fallback>
           <w:pict>
-            <v:rect id="Rectángulo 40" style="position:absolute;left:0;text-align:left;margin-left:0;margin-top:0;width:36pt;height:25.2pt;z-index:251661312;visibility:visible;mso-wrap-style:square;mso-width-percent:0;mso-height-percent:0;mso-top-percent:200;mso-wrap-distance-left:0;mso-wrap-distance-top:0;mso-wrap-distance-right:0;mso-wrap-distance-bottom:0;mso-position-horizontal:left;mso-position-horizontal-relative:right-margin-area;mso-position-vertical-relative:bottom-margin-area;mso-width-percent:0;mso-height-percent:0;mso-top-percent:200;mso-width-relative:margin;mso-height-relative:margin;v-text-anchor:bottom" o:spid="_x0000_s1029" fillcolor="black [3213]" stroked="f" strokeweight="3pt" w14:anchorId="3CF0A8BB" o:gfxdata="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">
+            <v:rect w14:anchorId="3CF0A8BB" id="Rectángulo 40" o:spid="_x0000_s1029" style="position:absolute;left:0;text-align:left;margin-left:0;margin-top:0;width:36pt;height:25.2pt;z-index:251661312;visibility:visible;mso-wrap-style:square;mso-width-percent:0;mso-height-percent:0;mso-top-percent:200;mso-wrap-distance-left:0;mso-wrap-distance-top:0;mso-wrap-distance-right:0;mso-wrap-distance-bottom:0;mso-position-horizontal:left;mso-position-horizontal-relative:right-margin-area;mso-position-vertical-relative:bottom-margin-area;mso-width-percent:0;mso-height-percent:0;mso-top-percent:200;mso-width-relative:margin;mso-height-relative:margin;v-text-anchor:bottom" o:gfxdata="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" fillcolor="black [3213]" stroked="f" strokeweight="3pt">
               <v:textbox>
                 <w:txbxContent>
                   <w:p>
@@ -9389,7 +10559,7 @@
 </file>
 
 <file path=word/footnotes.xml><?xml version="1.0" encoding="utf-8"?>
-<w:footnotes xmlns:wpc="http://schemas.microsoft.com/office/word/2010/wordprocessingCanvas" xmlns:cx="http://schemas.microsoft.com/office/drawing/2014/chartex" xmlns:cx1="http://schemas.microsoft.com/office/drawing/2015/9/8/chartex" xmlns:cx2="http://schemas.microsoft.com/office/drawing/2015/10/21/chartex" xmlns:cx3="http://schemas.microsoft.com/office/drawing/2016/5/9/chartex" xmlns:cx4="http://schemas.microsoft.com/office/drawing/2016/5/10/chartex" xmlns:cx5="http://schemas.microsoft.com/office/drawing/2016/5/11/chartex" xmlns:cx6="http://schemas.microsoft.com/office/drawing/2016/5/12/chartex" xmlns:cx7="http://schemas.microsoft.com/office/drawing/2016/5/13/chartex" xmlns:cx8="http://schemas.microsoft.com/office/drawing/2016/5/14/chartex" xmlns:mc="http://schemas.openxmlformats.org/markup-compatibility/2006" xmlns:aink="http://schemas.microsoft.com/office/drawing/2016/ink" xmlns:am3d="http://schemas.microsoft.com/office/drawing/2017/model3d" xmlns:o="urn:schemas-microsoft-com:office:office" xmlns:oel="http://schemas.microsoft.com/office/2019/extlst" xmlns:r="http://schemas.openxmlformats.org/officeDocument/2006/relationships" xmlns:m="http://schemas.openxmlformats.org/officeDocument/2006/math" xmlns:v="urn:schemas-microsoft-com:vml" xmlns:wp14="http://schemas.microsoft.com/office/word/2010/wordprocessingDrawing" xmlns:wp="http://schemas.openxmlformats.org/drawingml/2006/wordprocessingDrawing" xmlns:w10="urn:schemas-microsoft-com:office:word" xmlns:w="http://schemas.openxmlformats.org/wordprocessingml/2006/main" xmlns:w14="http://schemas.microsoft.com/office/word/2010/wordml" xmlns:w15="http://schemas.microsoft.com/office/word/2012/wordml" xmlns:w16cex="http://schemas.microsoft.com/office/word/2018/wordml/cex" xmlns:w16cid="http://schemas.microsoft.com/office/word/2016/wordml/cid" xmlns:w16="http://schemas.microsoft.com/office/word/2018/wordml" xmlns:w16sdtdh="http://schemas.microsoft.com/office/word/2020/wordml/sdtdatahash" xmlns:w16se="http://schemas.microsoft.com/office/word/2015/wordml/symex" xmlns:wpg="http://schemas.microsoft.com/office/word/2010/wordprocessingGroup" xmlns:wpi="http://schemas.microsoft.com/office/word/2010/wordprocessingInk" xmlns:wne="http://schemas.microsoft.com/office/word/2006/wordml" xmlns:wps="http://schemas.microsoft.com/office/word/2010/wordprocessingShape" mc:Ignorable="w14 w15 w16se w16cid w16 w16cex w16sdtdh wp14">
+<w:footnotes xmlns:wpc="http://schemas.microsoft.com/office/word/2010/wordprocessingCanvas" xmlns:cx="http://schemas.microsoft.com/office/drawing/2014/chartex" xmlns:cx1="http://schemas.microsoft.com/office/drawing/2015/9/8/chartex" xmlns:cx2="http://schemas.microsoft.com/office/drawing/2015/10/21/chartex" xmlns:cx3="http://schemas.microsoft.com/office/drawing/2016/5/9/chartex" xmlns:cx4="http://schemas.microsoft.com/office/drawing/2016/5/10/chartex" xmlns:cx5="http://schemas.microsoft.com/office/drawing/2016/5/11/chartex" xmlns:cx6="http://schemas.microsoft.com/office/drawing/2016/5/12/chartex" xmlns:cx7="http://schemas.microsoft.com/office/drawing/2016/5/13/chartex" xmlns:cx8="http://schemas.microsoft.com/office/drawing/2016/5/14/chartex" xmlns:mc="http://schemas.openxmlformats.org/markup-compatibility/2006" xmlns:aink="http://schemas.microsoft.com/office/drawing/2016/ink" xmlns:am3d="http://schemas.microsoft.com/office/drawing/2017/model3d" xmlns:o="urn:schemas-microsoft-com:office:office" xmlns:oel="http://schemas.microsoft.com/office/2019/extlst" xmlns:r="http://schemas.openxmlformats.org/officeDocument/2006/relationships" xmlns:m="http://schemas.openxmlformats.org/officeDocument/2006/math" xmlns:v="urn:schemas-microsoft-com:vml" xmlns:wp14="http://schemas.microsoft.com/office/word/2010/wordprocessingDrawing" xmlns:wp="http://schemas.openxmlformats.org/drawingml/2006/wordprocessingDrawing" xmlns:w10="urn:schemas-microsoft-com:office:word" xmlns:w="http://schemas.openxmlformats.org/wordprocessingml/2006/main" xmlns:w14="http://schemas.microsoft.com/office/word/2010/wordml" xmlns:w15="http://schemas.microsoft.com/office/word/2012/wordml" xmlns:w16cex="http://schemas.microsoft.com/office/word/2018/wordml/cex" xmlns:w16cid="http://schemas.microsoft.com/office/word/2016/wordml/cid" xmlns:w16="http://schemas.microsoft.com/office/word/2018/wordml" xmlns:w16du="http://schemas.microsoft.com/office/word/2023/wordml/word16du" xmlns:w16sdtdh="http://schemas.microsoft.com/office/word/2020/wordml/sdtdatahash" xmlns:w16sdtfl="http://schemas.microsoft.com/office/word/2024/wordml/sdtformatlock" xmlns:w16se="http://schemas.microsoft.com/office/word/2015/wordml/symex" xmlns:wpg="http://schemas.microsoft.com/office/word/2010/wordprocessingGroup" xmlns:wpi="http://schemas.microsoft.com/office/word/2010/wordprocessingInk" xmlns:wne="http://schemas.microsoft.com/office/word/2006/wordml" xmlns:wps="http://schemas.microsoft.com/office/word/2010/wordprocessingShape" mc:Ignorable="w14 w15 w16se w16cid w16 w16cex w16sdtdh w16sdtfl w16du wp14">
   <w:footnote w:type="separator" w:id="-1">
     <w:p>
       <w:r>
@@ -9408,7 +10578,7 @@
 </file>
 
 <file path=word/header1.xml><?xml version="1.0" encoding="utf-8"?>
-<w:hdr xmlns:wpc="http://schemas.microsoft.com/office/word/2010/wordprocessingCanvas" xmlns:cx="http://schemas.microsoft.com/office/drawing/2014/chartex" xmlns:cx1="http://schemas.microsoft.com/office/drawing/2015/9/8/chartex" xmlns:cx2="http://schemas.microsoft.com/office/drawing/2015/10/21/chartex" xmlns:cx3="http://schemas.microsoft.com/office/drawing/2016/5/9/chartex" xmlns:cx4="http://schemas.microsoft.com/office/drawing/2016/5/10/chartex" xmlns:cx5="http://schemas.microsoft.com/office/drawing/2016/5/11/chartex" xmlns:cx6="http://schemas.microsoft.com/office/drawing/2016/5/12/chartex" xmlns:cx7="http://schemas.microsoft.com/office/drawing/2016/5/13/chartex" xmlns:cx8="http://schemas.microsoft.com/office/drawing/2016/5/14/chartex" xmlns:mc="http://schemas.openxmlformats.org/markup-compatibility/2006" xmlns:aink="http://schemas.microsoft.com/office/drawing/2016/ink" xmlns:am3d="http://schemas.microsoft.com/office/drawing/2017/model3d" xmlns:o="urn:schemas-microsoft-com:office:office" xmlns:oel="http://schemas.microsoft.com/office/2019/extlst" xmlns:r="http://schemas.openxmlformats.org/officeDocument/2006/relationships" xmlns:m="http://schemas.openxmlformats.org/officeDocument/2006/math" xmlns:v="urn:schemas-microsoft-com:vml" xmlns:wp14="http://schemas.microsoft.com/office/word/2010/wordprocessingDrawing" xmlns:wp="http://schemas.openxmlformats.org/drawingml/2006/wordprocessingDrawing" xmlns:w10="urn:schemas-microsoft-com:office:word" xmlns:w="http://schemas.openxmlformats.org/wordprocessingml/2006/main" xmlns:w14="http://schemas.microsoft.com/office/word/2010/wordml" xmlns:w15="http://schemas.microsoft.com/office/word/2012/wordml" xmlns:w16cex="http://schemas.microsoft.com/office/word/2018/wordml/cex" xmlns:w16cid="http://schemas.microsoft.com/office/word/2016/wordml/cid" xmlns:w16="http://schemas.microsoft.com/office/word/2018/wordml" xmlns:w16sdtdh="http://schemas.microsoft.com/office/word/2020/wordml/sdtdatahash" xmlns:w16se="http://schemas.microsoft.com/office/word/2015/wordml/symex" xmlns:wpg="http://schemas.microsoft.com/office/word/2010/wordprocessingGroup" xmlns:wpi="http://schemas.microsoft.com/office/word/2010/wordprocessingInk" xmlns:wne="http://schemas.microsoft.com/office/word/2006/wordml" xmlns:wps="http://schemas.microsoft.com/office/word/2010/wordprocessingShape" mc:Ignorable="w14 w15 w16se w16cid w16 w16cex w16sdtdh wp14">
+<w:hdr xmlns:wpc="http://schemas.microsoft.com/office/word/2010/wordprocessingCanvas" xmlns:cx="http://schemas.microsoft.com/office/drawing/2014/chartex" xmlns:cx1="http://schemas.microsoft.com/office/drawing/2015/9/8/chartex" xmlns:cx2="http://schemas.microsoft.com/office/drawing/2015/10/21/chartex" xmlns:cx3="http://schemas.microsoft.com/office/drawing/2016/5/9/chartex" xmlns:cx4="http://schemas.microsoft.com/office/drawing/2016/5/10/chartex" xmlns:cx5="http://schemas.microsoft.com/office/drawing/2016/5/11/chartex" xmlns:cx6="http://schemas.microsoft.com/office/drawing/2016/5/12/chartex" xmlns:cx7="http://schemas.microsoft.com/office/drawing/2016/5/13/chartex" xmlns:cx8="http://schemas.microsoft.com/office/drawing/2016/5/14/chartex" xmlns:mc="http://schemas.openxmlformats.org/markup-compatibility/2006" xmlns:aink="http://schemas.microsoft.com/office/drawing/2016/ink" xmlns:am3d="http://schemas.microsoft.com/office/drawing/2017/model3d" xmlns:o="urn:schemas-microsoft-com:office:office" xmlns:oel="http://schemas.microsoft.com/office/2019/extlst" xmlns:r="http://schemas.openxmlformats.org/officeDocument/2006/relationships" xmlns:m="http://schemas.openxmlformats.org/officeDocument/2006/math" xmlns:v="urn:schemas-microsoft-com:vml" xmlns:wp14="http://schemas.microsoft.com/office/word/2010/wordprocessingDrawing" xmlns:wp="http://schemas.openxmlformats.org/drawingml/2006/wordprocessingDrawing" xmlns:w10="urn:schemas-microsoft-com:office:word" xmlns:w="http://schemas.openxmlformats.org/wordprocessingml/2006/main" xmlns:w14="http://schemas.microsoft.com/office/word/2010/wordml" xmlns:w15="http://schemas.microsoft.com/office/word/2012/wordml" xmlns:w16cex="http://schemas.microsoft.com/office/word/2018/wordml/cex" xmlns:w16cid="http://schemas.microsoft.com/office/word/2016/wordml/cid" xmlns:w16="http://schemas.microsoft.com/office/word/2018/wordml" xmlns:w16du="http://schemas.microsoft.com/office/word/2023/wordml/word16du" xmlns:w16sdtdh="http://schemas.microsoft.com/office/word/2020/wordml/sdtdatahash" xmlns:w16sdtfl="http://schemas.microsoft.com/office/word/2024/wordml/sdtformatlock" xmlns:w16se="http://schemas.microsoft.com/office/word/2015/wordml/symex" xmlns:wpg="http://schemas.microsoft.com/office/word/2010/wordprocessingGroup" xmlns:wpi="http://schemas.microsoft.com/office/word/2010/wordprocessingInk" xmlns:wne="http://schemas.microsoft.com/office/word/2006/wordml" xmlns:wps="http://schemas.microsoft.com/office/word/2010/wordprocessingShape" mc:Ignorable="w14 w15 w16se w16cid w16 w16cex w16sdtdh w16sdtfl w16du wp14">
   <w:p>
     <w:pPr>
       <w:pStyle w:val="Encabezado"/>
@@ -9506,7 +10676,7 @@
 </file>
 
 <file path=word/numbering.xml><?xml version="1.0" encoding="utf-8"?>
-<w:numbering xmlns:wpc="http://schemas.microsoft.com/office/word/2010/wordprocessingCanvas" xmlns:cx="http://schemas.microsoft.com/office/drawing/2014/chartex" xmlns:cx1="http://schemas.microsoft.com/office/drawing/2015/9/8/chartex" xmlns:cx2="http://schemas.microsoft.com/office/drawing/2015/10/21/chartex" xmlns:cx3="http://schemas.microsoft.com/office/drawing/2016/5/9/chartex" xmlns:cx4="http://schemas.microsoft.com/office/drawing/2016/5/10/chartex" xmlns:cx5="http://schemas.microsoft.com/office/drawing/2016/5/11/chartex" xmlns:cx6="http://schemas.microsoft.com/office/drawing/2016/5/12/chartex" xmlns:cx7="http://schemas.microsoft.com/office/drawing/2016/5/13/chartex" xmlns:cx8="http://schemas.microsoft.com/office/drawing/2016/5/14/chartex" xmlns:mc="http://schemas.openxmlformats.org/markup-compatibility/2006" xmlns:aink="http://schemas.microsoft.com/office/drawing/2016/ink" xmlns:am3d="http://schemas.microsoft.com/office/drawing/2017/model3d" xmlns:o="urn:schemas-microsoft-com:office:office" xmlns:oel="http://schemas.microsoft.com/office/2019/extlst" xmlns:r="http://schemas.openxmlformats.org/officeDocument/2006/relationships" xmlns:m="http://schemas.openxmlformats.org/officeDocument/2006/math" xmlns:v="urn:schemas-microsoft-com:vml" xmlns:wp14="http://schemas.microsoft.com/office/word/2010/wordprocessingDrawing" xmlns:wp="http://schemas.openxmlformats.org/drawingml/2006/wordprocessingDrawing" xmlns:w10="urn:schemas-microsoft-com:office:word" xmlns:w="http://schemas.openxmlformats.org/wordprocessingml/2006/main" xmlns:w14="http://schemas.microsoft.com/office/word/2010/wordml" xmlns:w15="http://schemas.microsoft.com/office/word/2012/wordml" xmlns:w16cex="http://schemas.microsoft.com/office/word/2018/wordml/cex" xmlns:w16cid="http://schemas.microsoft.com/office/word/2016/wordml/cid" xmlns:w16="http://schemas.microsoft.com/office/word/2018/wordml" xmlns:w16sdtdh="http://schemas.microsoft.com/office/word/2020/wordml/sdtdatahash" xmlns:w16se="http://schemas.microsoft.com/office/word/2015/wordml/symex" xmlns:wpg="http://schemas.microsoft.com/office/word/2010/wordprocessingGroup" xmlns:wpi="http://schemas.microsoft.com/office/word/2010/wordprocessingInk" xmlns:wne="http://schemas.microsoft.com/office/word/2006/wordml" xmlns:wps="http://schemas.microsoft.com/office/word/2010/wordprocessingShape" mc:Ignorable="w14 w15 w16se w16cid w16 w16cex w16sdtdh wp14">
+<w:numbering xmlns:wpc="http://schemas.microsoft.com/office/word/2010/wordprocessingCanvas" xmlns:cx="http://schemas.microsoft.com/office/drawing/2014/chartex" xmlns:cx1="http://schemas.microsoft.com/office/drawing/2015/9/8/chartex" xmlns:cx2="http://schemas.microsoft.com/office/drawing/2015/10/21/chartex" xmlns:cx3="http://schemas.microsoft.com/office/drawing/2016/5/9/chartex" xmlns:cx4="http://schemas.microsoft.com/office/drawing/2016/5/10/chartex" xmlns:cx5="http://schemas.microsoft.com/office/drawing/2016/5/11/chartex" xmlns:cx6="http://schemas.microsoft.com/office/drawing/2016/5/12/chartex" xmlns:cx7="http://schemas.microsoft.com/office/drawing/2016/5/13/chartex" xmlns:cx8="http://schemas.microsoft.com/office/drawing/2016/5/14/chartex" xmlns:mc="http://schemas.openxmlformats.org/markup-compatibility/2006" xmlns:aink="http://schemas.microsoft.com/office/drawing/2016/ink" xmlns:am3d="http://schemas.microsoft.com/office/drawing/2017/model3d" xmlns:o="urn:schemas-microsoft-com:office:office" xmlns:oel="http://schemas.microsoft.com/office/2019/extlst" xmlns:r="http://schemas.openxmlformats.org/officeDocument/2006/relationships" xmlns:m="http://schemas.openxmlformats.org/officeDocument/2006/math" xmlns:v="urn:schemas-microsoft-com:vml" xmlns:wp14="http://schemas.microsoft.com/office/word/2010/wordprocessingDrawing" xmlns:wp="http://schemas.openxmlformats.org/drawingml/2006/wordprocessingDrawing" xmlns:w10="urn:schemas-microsoft-com:office:word" xmlns:w="http://schemas.openxmlformats.org/wordprocessingml/2006/main" xmlns:w14="http://schemas.microsoft.com/office/word/2010/wordml" xmlns:w15="http://schemas.microsoft.com/office/word/2012/wordml" xmlns:w16cex="http://schemas.microsoft.com/office/word/2018/wordml/cex" xmlns:w16cid="http://schemas.microsoft.com/office/word/2016/wordml/cid" xmlns:w16="http://schemas.microsoft.com/office/word/2018/wordml" xmlns:w16du="http://schemas.microsoft.com/office/word/2023/wordml/word16du" xmlns:w16sdtdh="http://schemas.microsoft.com/office/word/2020/wordml/sdtdatahash" xmlns:w16sdtfl="http://schemas.microsoft.com/office/word/2024/wordml/sdtformatlock" xmlns:w16se="http://schemas.microsoft.com/office/word/2015/wordml/symex" xmlns:wpg="http://schemas.microsoft.com/office/word/2010/wordprocessingGroup" xmlns:wpi="http://schemas.microsoft.com/office/word/2010/wordprocessingInk" xmlns:wne="http://schemas.microsoft.com/office/word/2006/wordml" xmlns:wps="http://schemas.microsoft.com/office/word/2010/wordprocessingShape" mc:Ignorable="w14 w15 w16se w16cid w16 w16cex w16sdtdh w16sdtfl w16du wp14">
   <w:abstractNum w:abstractNumId="0" w15:restartNumberingAfterBreak="0">
     <w:nsid w:val="08183884"/>
     <w:multiLevelType w:val="hybridMultilevel"/>
@@ -12865,7 +14035,7 @@
 </file>
 
 <file path=word/styles.xml><?xml version="1.0" encoding="utf-8"?>
-<w:styles xmlns:mc="http://schemas.openxmlformats.org/markup-compatibility/2006" xmlns:r="http://schemas.openxmlformats.org/officeDocument/2006/relationships" xmlns:w="http://schemas.openxmlformats.org/wordprocessingml/2006/main" xmlns:w14="http://schemas.microsoft.com/office/word/2010/wordml" xmlns:w15="http://schemas.microsoft.com/office/word/2012/wordml" xmlns:w16cex="http://schemas.microsoft.com/office/word/2018/wordml/cex" xmlns:w16cid="http://schemas.microsoft.com/office/word/2016/wordml/cid" xmlns:w16="http://schemas.microsoft.com/office/word/2018/wordml" xmlns:w16sdtdh="http://schemas.microsoft.com/office/word/2020/wordml/sdtdatahash" xmlns:w16se="http://schemas.microsoft.com/office/word/2015/wordml/symex" mc:Ignorable="w14 w15 w16se w16cid w16 w16cex w16sdtdh">
+<w:styles xmlns:mc="http://schemas.openxmlformats.org/markup-compatibility/2006" xmlns:r="http://schemas.openxmlformats.org/officeDocument/2006/relationships" xmlns:w="http://schemas.openxmlformats.org/wordprocessingml/2006/main" xmlns:w14="http://schemas.microsoft.com/office/word/2010/wordml" xmlns:w15="http://schemas.microsoft.com/office/word/2012/wordml" xmlns:w16cex="http://schemas.microsoft.com/office/word/2018/wordml/cex" xmlns:w16cid="http://schemas.microsoft.com/office/word/2016/wordml/cid" xmlns:w16="http://schemas.microsoft.com/office/word/2018/wordml" xmlns:w16du="http://schemas.microsoft.com/office/word/2023/wordml/word16du" xmlns:w16sdtdh="http://schemas.microsoft.com/office/word/2020/wordml/sdtdatahash" xmlns:w16sdtfl="http://schemas.microsoft.com/office/word/2024/wordml/sdtformatlock" xmlns:w16se="http://schemas.microsoft.com/office/word/2015/wordml/symex" mc:Ignorable="w14 w15 w16se w16cid w16 w16cex w16sdtdh w16sdtfl w16du">
   <w:docDefaults>
     <w:rPrDefault>
       <w:rPr>
@@ -12987,6 +14157,7 @@
     <w:lsdException w:name="HTML Sample" w:semiHidden="1" w:unhideWhenUsed="1"/>
     <w:lsdException w:name="HTML Typewriter" w:semiHidden="1" w:unhideWhenUsed="1"/>
     <w:lsdException w:name="HTML Variable" w:semiHidden="1" w:unhideWhenUsed="1"/>
+    <w:lsdException w:name="Normal Table" w:semiHidden="1" w:unhideWhenUsed="1"/>
     <w:lsdException w:name="annotation subject" w:semiHidden="1" w:unhideWhenUsed="1"/>
     <w:lsdException w:name="No List" w:semiHidden="1" w:unhideWhenUsed="1"/>
     <w:lsdException w:name="Outline List 1" w:semiHidden="1" w:unhideWhenUsed="1"/>
@@ -13029,8 +14200,11 @@
     <w:lsdException w:name="Table Contemporary" w:semiHidden="1" w:unhideWhenUsed="1"/>
     <w:lsdException w:name="Table Elegant" w:semiHidden="1" w:unhideWhenUsed="1"/>
     <w:lsdException w:name="Table Professional" w:semiHidden="1" w:unhideWhenUsed="1"/>
+    <w:lsdException w:name="Table Subtle 1" w:semiHidden="1" w:unhideWhenUsed="1"/>
     <w:lsdException w:name="Table Subtle 2" w:semiHidden="1" w:unhideWhenUsed="1"/>
     <w:lsdException w:name="Table Web 1" w:semiHidden="1" w:unhideWhenUsed="1"/>
+    <w:lsdException w:name="Table Web 2" w:semiHidden="1" w:unhideWhenUsed="1"/>
+    <w:lsdException w:name="Table Web 3" w:semiHidden="1" w:unhideWhenUsed="1"/>
     <w:lsdException w:name="Balloon Text" w:semiHidden="1" w:unhideWhenUsed="1"/>
     <w:lsdException w:name="Table Grid" w:uiPriority="39"/>
     <w:lsdException w:name="Table Theme" w:semiHidden="1" w:unhideWhenUsed="1"/>
@@ -13271,7 +14445,6 @@
   <w:style w:type="character" w:default="1" w:styleId="Fuentedeprrafopredeter">
     <w:name w:val="Default Paragraph Font"/>
     <w:uiPriority w:val="1"/>
-    <w:semiHidden/>
     <w:unhideWhenUsed/>
   </w:style>
   <w:style w:type="table" w:default="1" w:styleId="Tablanormal">
@@ -13745,7 +14918,7 @@
       <w:lang w:val="es-CL" w:eastAsia="es-CL"/>
     </w:rPr>
   </w:style>
-  <w:style w:type="character" w:styleId="Textoennegrita">
+  <w:style w:type="character" w:styleId="Fuerte">
     <w:name w:val="Strong"/>
     <w:basedOn w:val="Fuentedeprrafopredeter"/>
     <w:uiPriority w:val="22"/>
@@ -14032,16 +15205,25 @@
 </file>
 
 <file path=customXml/item2.xml><?xml version="1.0" encoding="utf-8"?>
-<b:Sources xmlns:b="http://schemas.openxmlformats.org/officeDocument/2006/bibliography" xmlns="http://schemas.openxmlformats.org/officeDocument/2006/bibliography" SelectedStyle="\APASixthEditionOfficeOnline.xsl" StyleName="APA" Version="6"/>
-</file>
-
-<file path=customXml/item3.xml><?xml version="1.0" encoding="utf-8"?>
 <p:properties xmlns:p="http://schemas.microsoft.com/office/2006/metadata/properties" xmlns:xsi="http://www.w3.org/2001/XMLSchema-instance" xmlns:pc="http://schemas.microsoft.com/office/infopath/2007/PartnerControls">
   <documentManagement/>
 </p:properties>
 </file>
 
+<file path=customXml/item3.xml><?xml version="1.0" encoding="utf-8"?>
+<b:Sources xmlns:b="http://schemas.openxmlformats.org/officeDocument/2006/bibliography" xmlns="http://schemas.openxmlformats.org/officeDocument/2006/bibliography" SelectedStyle="\APASixthEditionOfficeOnline.xsl" StyleName="APA" Version="6"/>
+</file>
+
 <file path=customXml/item4.xml><?xml version="1.0" encoding="utf-8"?>
+<?mso-contentType ?>
+<FormTemplates xmlns="http://schemas.microsoft.com/sharepoint/v3/contenttype/forms">
+  <Display>DocumentLibraryForm</Display>
+  <Edit>DocumentLibraryForm</Edit>
+  <New>DocumentLibraryForm</New>
+</FormTemplates>
+</file>
+
+<file path=customXml/item5.xml><?xml version="1.0" encoding="utf-8"?>
 <ct:contentTypeSchema xmlns:ct="http://schemas.microsoft.com/office/2006/metadata/contentType" xmlns:ma="http://schemas.microsoft.com/office/2006/metadata/properties/metaAttributes" ct:_="" ma:_="" ma:contentTypeName="Documento" ma:contentTypeID="0x010100E96778489EE7714D8BD12CC105EB918B" ma:contentTypeVersion="2" ma:contentTypeDescription="Crear nuevo documento." ma:contentTypeScope="" ma:versionID="416c5c7ae9b5d54d83875cd3c65194e3">
   <xsd:schema xmlns:xsd="http://www.w3.org/2001/XMLSchema" xmlns:xs="http://www.w3.org/2001/XMLSchema" xmlns:p="http://schemas.microsoft.com/office/2006/metadata/properties" xmlns:ns2="126e8a1c-9ea9-435a-ac89-d06c80d62e30" targetNamespace="http://schemas.microsoft.com/office/2006/metadata/properties" ma:root="true" ma:fieldsID="70a237c842677bd850644f8595079f5e" ns2:_="">
     <xsd:import namespace="126e8a1c-9ea9-435a-ac89-d06c80d62e30"/>
@@ -14173,15 +15355,6 @@
 </ct:contentTypeSchema>
 </file>
 
-<file path=customXml/item5.xml><?xml version="1.0" encoding="utf-8"?>
-<?mso-contentType ?>
-<FormTemplates xmlns="http://schemas.microsoft.com/sharepoint/v3/contenttype/forms">
-  <Display>DocumentLibraryForm</Display>
-  <Edit>DocumentLibraryForm</Edit>
-  <New>DocumentLibraryForm</New>
-</FormTemplates>
-</file>
-
 <file path=customXml/itemProps1.xml><?xml version="1.0" encoding="utf-8"?>
 <ds:datastoreItem xmlns:ds="http://schemas.openxmlformats.org/officeDocument/2006/customXml" ds:itemID="{55AF091B-3C7A-41E3-B477-F2FDAA23CFDA}">
   <ds:schemaRefs>
@@ -14191,14 +15364,6 @@
 </file>
 
 <file path=customXml/itemProps2.xml><?xml version="1.0" encoding="utf-8"?>
-<ds:datastoreItem xmlns:ds="http://schemas.openxmlformats.org/officeDocument/2006/customXml" ds:itemID="{028C5B15-B524-4B7C-9DF0-F573AFD0F54E}">
-  <ds:schemaRefs>
-    <ds:schemaRef ds:uri="http://schemas.openxmlformats.org/officeDocument/2006/bibliography"/>
-  </ds:schemaRefs>
-</ds:datastoreItem>
-</file>
-
-<file path=customXml/itemProps3.xml><?xml version="1.0" encoding="utf-8"?>
 <ds:datastoreItem xmlns:ds="http://schemas.openxmlformats.org/officeDocument/2006/customXml" ds:itemID="{5B7B5873-BEF7-4EF9-B783-7B50266FE496}">
   <ds:schemaRefs>
     <ds:schemaRef ds:uri="http://schemas.microsoft.com/office/2006/metadata/properties"/>
@@ -14207,7 +15372,23 @@
 </ds:datastoreItem>
 </file>
 
+<file path=customXml/itemProps3.xml><?xml version="1.0" encoding="utf-8"?>
+<ds:datastoreItem xmlns:ds="http://schemas.openxmlformats.org/officeDocument/2006/customXml" ds:itemID="{028C5B15-B524-4B7C-9DF0-F573AFD0F54E}">
+  <ds:schemaRefs>
+    <ds:schemaRef ds:uri="http://schemas.openxmlformats.org/officeDocument/2006/bibliography"/>
+  </ds:schemaRefs>
+</ds:datastoreItem>
+</file>
+
 <file path=customXml/itemProps4.xml><?xml version="1.0" encoding="utf-8"?>
+<ds:datastoreItem xmlns:ds="http://schemas.openxmlformats.org/officeDocument/2006/customXml" ds:itemID="{4EF1E242-F579-4982-B8CC-2FBF33737424}">
+  <ds:schemaRefs>
+    <ds:schemaRef ds:uri="http://schemas.microsoft.com/sharepoint/v3/contenttype/forms"/>
+  </ds:schemaRefs>
+</ds:datastoreItem>
+</file>
+
+<file path=customXml/itemProps5.xml><?xml version="1.0" encoding="utf-8"?>
 <ds:datastoreItem xmlns:ds="http://schemas.openxmlformats.org/officeDocument/2006/customXml" ds:itemID="{14D1F39E-8B56-417C-B337-6A9061C37D5D}">
   <ds:schemaRefs>
     <ds:schemaRef ds:uri="http://schemas.microsoft.com/office/2006/metadata/contentType"/>
@@ -14223,12 +15404,4 @@
     <ds:schemaRef ds:uri="http://schemas.microsoft.com/internal/obd"/>
   </ds:schemaRefs>
 </ds:datastoreItem>
-</file>
-
-<file path=customXml/itemProps5.xml><?xml version="1.0" encoding="utf-8"?>
-<ds:datastoreItem xmlns:ds="http://schemas.openxmlformats.org/officeDocument/2006/customXml" ds:itemID="{4EF1E242-F579-4982-B8CC-2FBF33737424}">
-  <ds:schemaRefs>
-    <ds:schemaRef ds:uri="http://schemas.microsoft.com/sharepoint/v3/contenttype/forms"/>
-  </ds:schemaRefs>
-</ds:datastoreItem>
 </file>
</xml_diff>